<commit_message>
Phase 10-11: final docs, README, requirements
</commit_message>
<xml_diff>
--- a/docs/AirControl_AI_Design.docx
+++ b/docs/AirControl_AI_Design.docx
@@ -278,7 +278,7 @@
                 <w:sz w:val="21"/>
                 <w:szCs w:val="21"/>
               </w:rPr>
-              <w:t xml:space="preserve">1.0 (Draft)</w:t>
+              <w:t xml:space="preserve">1.1 (Final, as built)</w:t>
             </w:r>
           </w:p>
         </w:tc>
@@ -349,7 +349,7 @@
                 <w:sz w:val="21"/>
                 <w:szCs w:val="21"/>
               </w:rPr>
-              <w:t xml:space="preserve">October 20, 2026</w:t>
+              <w:t xml:space="preserve">October 28, 2026</w:t>
             </w:r>
           </w:p>
         </w:tc>
@@ -560,7 +560,7 @@
                 <w:sz w:val="21"/>
                 <w:szCs w:val="21"/>
               </w:rPr>
-              <w:t xml:space="preserve">SRS v1.0 and Use Cases v1.0</w:t>
+              <w:t xml:space="preserve">SRS v1.0, Use Cases v1.0 and Test Plan v1.0</w:t>
             </w:r>
           </w:p>
         </w:tc>
@@ -603,6 +603,19 @@
           <w:szCs w:val="22"/>
         </w:rPr>
         <w:t xml:space="preserve">This document describes how AirControl AI will be built. It turns the requirements (SRS) and the Use Cases into a software design: the overall Architecture, the classes of the system (Class Diagram) and the order of interactions for the main scenario (Sequence Diagram). It is the blueprint used in the implementation phases.</w:t>
+      </w:r>
+    </w:p>
+    <w:p>
+      <w:pPr>
+        <w:spacing w:after="120" w:line="276"/>
+      </w:pPr>
+      <w:r>
+        <w:rPr>
+          <w:rFonts w:ascii="Calibri" w:cs="Calibri" w:eastAsia="Calibri" w:hAnsi="Calibri"/>
+          <w:sz w:val="22"/>
+          <w:szCs w:val="22"/>
+        </w:rPr>
+        <w:t xml:space="preserve">Version 1.1 describes the program as it was finally built and tested. Where the final code differs from the first design (version 1.0), the difference and its reason are listed in Section 9.</w:t>
       </w:r>
     </w:p>
     <w:p>
@@ -1270,7 +1283,7 @@
                 <w:sz w:val="21"/>
                 <w:szCs w:val="21"/>
               </w:rPr>
-              <w:t xml:space="preserve">Shows buttons, live camera view, current gesture and volume. Contains no recognition logic.</w:t>
+              <w:t xml:space="preserve">Shows the live camera view, current gesture, FPS, volume, the Enable/Disable button and the Video state buttons. Contains no recognition logic.</w:t>
             </w:r>
           </w:p>
         </w:tc>
@@ -1410,7 +1423,7 @@
                 <w:sz w:val="21"/>
                 <w:szCs w:val="21"/>
               </w:rPr>
-              <w:t xml:space="preserve">Keeps the state (camera on/off, control on/off), creates the other objects and runs the per-frame process.</w:t>
+              <w:t xml:space="preserve">Keeps the state (control on/off, camera running), creates the other objects and runs the per-frame process. Has no window code, so it is tested without a screen.</w:t>
             </w:r>
           </w:p>
         </w:tc>
@@ -1654,7 +1667,7 @@
                 <w:sz w:val="21"/>
                 <w:szCs w:val="21"/>
               </w:rPr>
-              <w:t xml:space="preserve">GestureRecognizer, GestureStabilizer</w:t>
+              <w:t xml:space="preserve">MotionFilter, GestureRecognizer, GestureStabilizer</w:t>
             </w:r>
           </w:p>
         </w:tc>
@@ -1688,7 +1701,7 @@
                 <w:sz w:val="21"/>
                 <w:szCs w:val="21"/>
               </w:rPr>
-              <w:t xml:space="preserve">Decides which gesture is shown, and confirms it only if held steadily and not in cooldown.</w:t>
+              <w:t xml:space="preserve">Accepts gestures only from a still hand, decides which gesture is shown, and confirms it only if it is held for enough frames.</w:t>
             </w:r>
           </w:p>
         </w:tc>
@@ -1826,7 +1839,7 @@
                 <w:sz w:val="21"/>
                 <w:szCs w:val="21"/>
               </w:rPr>
-              <w:t xml:space="preserve">Maps a gesture to a command and executes it on Windows.</w:t>
+              <w:t xml:space="preserve">Maps a gesture to a command (with repeat and cooldown) and executes it on Windows.</w:t>
             </w:r>
           </w:p>
         </w:tc>
@@ -1952,7 +1965,7 @@
           <w:sz w:val="22"/>
           <w:szCs w:val="22"/>
         </w:rPr>
-        <w:t xml:space="preserve">GestureType (for example THUMB_UP) from GestureRecognizer.</w:t>
+        <w:t xml:space="preserve">Change of the hand in the last 0.2 s from MotionFilter; the frame is ignored if the hand is not still.</w:t>
       </w:r>
     </w:p>
     <w:p>
@@ -1970,7 +1983,7 @@
           <w:sz w:val="22"/>
           <w:szCs w:val="22"/>
         </w:rPr>
-        <w:t xml:space="preserve">Confirmed gesture from GestureStabilizer (or NONE).</w:t>
+        <w:t xml:space="preserve">GestureType (for example THUMB_UP) from GestureRecognizer.</w:t>
       </w:r>
     </w:p>
     <w:p>
@@ -1988,7 +2001,25 @@
           <w:sz w:val="22"/>
           <w:szCs w:val="22"/>
         </w:rPr>
-        <w:t xml:space="preserve">Command (for example VOLUME_UP) from CommandMapper.</w:t>
+        <w:t xml:space="preserve">Confirmed gesture from GestureStabilizer (or NONE).</w:t>
+      </w:r>
+    </w:p>
+    <w:p>
+      <w:pPr>
+        <w:pStyle w:val="ListParagraph"/>
+        <w:numPr>
+          <w:ilvl w:val="0"/>
+          <w:numId w:val="2"/>
+        </w:numPr>
+        <w:spacing w:after="80" w:line="276"/>
+      </w:pPr>
+      <w:r>
+        <w:rPr>
+          <w:rFonts w:ascii="Calibri" w:cs="Calibri" w:eastAsia="Calibri" w:hAnsi="Calibri"/>
+          <w:sz w:val="22"/>
+          <w:szCs w:val="22"/>
+        </w:rPr>
+        <w:t xml:space="preserve">Command (for example VOLUME_UP) from CommandMapper, only if control is enabled.</w:t>
       </w:r>
     </w:p>
     <w:p>
@@ -2053,7 +2084,7 @@
       <w:r>
         <w:drawing>
           <wp:inline distT="0" distB="0" distL="0" distR="0">
-            <wp:extent cx="8858250" cy="4819650"/>
+            <wp:extent cx="8858250" cy="4933950"/>
             <wp:effectExtent t="0" r="0" b="0" l="0"/>
             <wp:docPr id="2" name="classd" descr="Class diagram of AirControl AI" title="Class Diagram"/>
             <wp:cNvGraphicFramePr>
@@ -2078,7 +2109,7 @@
                   <pic:spPr bwMode="auto">
                     <a:xfrm>
                       <a:off x="0" y="0"/>
-                      <a:ext cx="8858250" cy="4819650"/>
+                      <a:ext cx="8858250" cy="4933950"/>
                     </a:xfrm>
                     <a:prstGeom prst="rect">
                       <a:avLst/>
@@ -2381,6 +2412,19 @@
     </w:p>
     <w:p>
       <w:pPr>
+        <w:spacing w:after="120" w:line="276"/>
+      </w:pPr>
+      <w:r>
+        <w:rPr>
+          <w:rFonts w:ascii="Calibri" w:cs="Calibri" w:eastAsia="Calibri" w:hAnsi="Calibri"/>
+          <w:sz w:val="22"/>
+          <w:szCs w:val="22"/>
+        </w:rPr>
+        <w:t xml:space="preserve">In the final implementation one more step sits before the recognizer: MotionFilter.update(hand) checks that the hand is still, and gestures are recognized only in those frames. It is not drawn in Figure 3 to keep the diagram readable (see Section 9).</w:t>
+      </w:r>
+    </w:p>
+    <w:p>
+      <w:pPr>
         <w:pStyle w:val="Heading1"/>
         <w:keepNext/>
         <w:pBdr>
@@ -2593,7 +2637,7 @@
                 <w:sz w:val="21"/>
                 <w:szCs w:val="21"/>
               </w:rPr>
-              <w:t xml:space="preserve">Shows the Start/Stop Camera and Enable/Disable Control buttons, the live view with landmarks, the current gesture and the volume level. Forwards button clicks to AppController.</w:t>
+              <w:t xml:space="preserve">Tkinter window: live view with landmarks, current gesture, FPS, volume level and bar, status text, the Enable/Disable Control button (Space), the Video state buttons (Playing / Paused / Unknown), Retry camera and Quit (Esc). Runs the frame loop with Tk timers and forwards clicks to AppController.</w:t>
             </w:r>
           </w:p>
         </w:tc>
@@ -2699,7 +2743,7 @@
                 <w:sz w:val="21"/>
                 <w:szCs w:val="21"/>
               </w:rPr>
-              <w:t xml:space="preserve">Creates and owns the other objects, keeps camera_running and control_enabled, and runs process_frame() for every frame.</w:t>
+              <w:t xml:space="preserve">Creates and owns the other objects, keeps enabled (control is off at start) and running, and runs process_frame() for every frame: detect, motion filter, recognize, stabilize, map, execute. Returns a FrameResult for the window.</w:t>
             </w:r>
           </w:p>
         </w:tc>
@@ -2733,7 +2777,7 @@
                 <w:sz w:val="21"/>
                 <w:szCs w:val="21"/>
               </w:rPr>
-              <w:t xml:space="preserve">FR-01, FR-08</w:t>
+              <w:t xml:space="preserve">FR-01, FR-08, NFR-07</w:t>
             </w:r>
           </w:p>
         </w:tc>
@@ -2804,7 +2848,7 @@
                 <w:sz w:val="21"/>
                 <w:szCs w:val="21"/>
               </w:rPr>
-              <w:t xml:space="preserve">Opens, reads and releases the camera. Reports a failure if the camera is unavailable so the app does not crash.</w:t>
+              <w:t xml:space="preserve">Opens, reads (mirrored) and releases the camera. Asks for YUY2, 640x480, 30 FPS, which measurements showed gives 16.5 FPS instead of 10. Reports a failure instead of crashing.</w:t>
             </w:r>
           </w:p>
         </w:tc>
@@ -2837,7 +2881,7 @@
                 <w:sz w:val="21"/>
                 <w:szCs w:val="21"/>
               </w:rPr>
-              <w:t xml:space="preserve">FR-01, NFR-07</w:t>
+              <w:t xml:space="preserve">FR-01, NFR-01, NFR-07</w:t>
             </w:r>
           </w:p>
         </w:tc>
@@ -2910,7 +2954,7 @@
                 <w:sz w:val="21"/>
                 <w:szCs w:val="21"/>
               </w:rPr>
-              <w:t xml:space="preserve">Uses MediaPipe to find the hand and return its 21 landmarks (HandData). Draws the landmarks on the frame.</w:t>
+              <w:t xml:space="preserve">MediaPipe HandLandmarker (Tasks API, video mode, one hand). Returns HandData with the 21 landmarks and the image aspect ratio, draws the landmarks, and frees the model in close().</w:t>
             </w:r>
           </w:p>
         </w:tc>
@@ -2982,7 +3026,7 @@
                 <w:sz w:val="21"/>
                 <w:szCs w:val="21"/>
               </w:rPr>
-              <w:t xml:space="preserve">GestureRecognizer</w:t>
+              <w:t xml:space="preserve">MotionFilter</w:t>
             </w:r>
           </w:p>
         </w:tc>
@@ -3015,7 +3059,7 @@
                 <w:sz w:val="21"/>
                 <w:szCs w:val="21"/>
               </w:rPr>
-              <w:t xml:space="preserve">Rule-based logic: checks which fingers are up or down and the thumb direction, then returns a GestureType.</w:t>
+              <w:t xml:space="preserve">Measures how much the hand moved and changed shape in the last 0.2 s, in hand sizes. Gestures are accepted only when the change is below 0.08. Stops an opening, closing or raised hand from being read as another gesture.</w:t>
             </w:r>
           </w:p>
         </w:tc>
@@ -3048,7 +3092,7 @@
                 <w:sz w:val="21"/>
                 <w:szCs w:val="21"/>
               </w:rPr>
-              <w:t xml:space="preserve">FR-03</w:t>
+              <w:t xml:space="preserve">FR-11</w:t>
             </w:r>
           </w:p>
         </w:tc>
@@ -3087,7 +3131,7 @@
                 <w:sz w:val="21"/>
                 <w:szCs w:val="21"/>
               </w:rPr>
-              <w:t xml:space="preserve">GestureStabilizer</w:t>
+              <w:t xml:space="preserve">GestureRecognizer</w:t>
             </w:r>
           </w:p>
         </w:tc>
@@ -3121,7 +3165,7 @@
                 <w:sz w:val="21"/>
                 <w:szCs w:val="21"/>
               </w:rPr>
-              <w:t xml:space="preserve">Confirms a gesture only after it is held for hold_time, and blocks repeats during cooldown.</w:t>
+              <w:t xml:space="preserve">Rule-based: a finger is extended or curled by the ratio of its wrist-to-tip and wrist-to-middle-joint distances; the thumb by its vertical direction; distances are corrected for the image aspect ratio. analyze() returns the numbers, recognize() the GestureType.</w:t>
             </w:r>
           </w:p>
         </w:tc>
@@ -3155,7 +3199,7 @@
                 <w:sz w:val="21"/>
                 <w:szCs w:val="21"/>
               </w:rPr>
-              <w:t xml:space="preserve">FR-11, FR-12</w:t>
+              <w:t xml:space="preserve">FR-03</w:t>
             </w:r>
           </w:p>
         </w:tc>
@@ -3193,7 +3237,7 @@
                 <w:sz w:val="21"/>
                 <w:szCs w:val="21"/>
               </w:rPr>
-              <w:t xml:space="preserve">CommandMapper</w:t>
+              <w:t xml:space="preserve">GestureStabilizer</w:t>
             </w:r>
           </w:p>
         </w:tc>
@@ -3226,7 +3270,7 @@
                 <w:sz w:val="21"/>
                 <w:szCs w:val="21"/>
               </w:rPr>
-              <w:t xml:space="preserve">Converts a confirmed gesture into a Command using a dictionary, so mappings are easy to change later.</w:t>
+              <w:t xml:space="preserve">Confirms a gesture only after it is seen in N frames in a row. N is set per gesture: thumb 8, closed fist 6, open palm 10 frames (tuned on real recordings).</w:t>
             </w:r>
           </w:p>
         </w:tc>
@@ -3259,7 +3303,7 @@
                 <w:sz w:val="21"/>
                 <w:szCs w:val="21"/>
               </w:rPr>
-              <w:t xml:space="preserve">FR-04 to FR-07</w:t>
+              <w:t xml:space="preserve">FR-11</w:t>
             </w:r>
           </w:p>
         </w:tc>
@@ -3298,7 +3342,7 @@
                 <w:sz w:val="21"/>
                 <w:szCs w:val="21"/>
               </w:rPr>
-              <w:t xml:space="preserve">VolumeController</w:t>
+              <w:t xml:space="preserve">CommandMapper</w:t>
             </w:r>
           </w:p>
         </w:tc>
@@ -3332,7 +3376,7 @@
                 <w:sz w:val="21"/>
                 <w:szCs w:val="21"/>
               </w:rPr>
-              <w:t xml:space="preserve">Reads and changes the Windows system volume with Pycaw.</w:t>
+              <w:t xml:space="preserve">Converts a stable gesture into a Command with a dictionary. Volume repeats every 0.3 s while held; Play and Pause fire once per gesture.</w:t>
             </w:r>
           </w:p>
         </w:tc>
@@ -3366,7 +3410,7 @@
                 <w:sz w:val="21"/>
                 <w:szCs w:val="21"/>
               </w:rPr>
-              <w:t xml:space="preserve">FR-04, FR-05, FR-10</w:t>
+              <w:t xml:space="preserve">FR-04 to FR-07, FR-12</w:t>
             </w:r>
           </w:p>
         </w:tc>
@@ -3404,7 +3448,7 @@
                 <w:sz w:val="21"/>
                 <w:szCs w:val="21"/>
               </w:rPr>
-              <w:t xml:space="preserve">MediaController</w:t>
+              <w:t xml:space="preserve">VolumeController</w:t>
             </w:r>
           </w:p>
         </w:tc>
@@ -3437,7 +3481,7 @@
                 <w:sz w:val="21"/>
                 <w:szCs w:val="21"/>
               </w:rPr>
-              <w:t xml:space="preserve">Sends play/pause to Windows with PyAutoGUI and remembers whether the video is playing (is_playing).</w:t>
+              <w:t xml:space="preserve">Reads and changes the Windows volume with Pycaw in steps of 5%, limited to 0-100%. Returns None instead of crashing if there is no audio device.</w:t>
             </w:r>
           </w:p>
         </w:tc>
@@ -3470,7 +3514,7 @@
                 <w:sz w:val="21"/>
                 <w:szCs w:val="21"/>
               </w:rPr>
-              <w:t xml:space="preserve">FR-06, FR-07</w:t>
+              <w:t xml:space="preserve">FR-04, FR-05, FR-10, NFR-07</w:t>
             </w:r>
           </w:p>
         </w:tc>
@@ -3509,7 +3553,7 @@
                 <w:sz w:val="21"/>
                 <w:szCs w:val="21"/>
               </w:rPr>
-              <w:t xml:space="preserve">Shared Data Types</w:t>
+              <w:t xml:space="preserve">MediaController</w:t>
             </w:r>
           </w:p>
         </w:tc>
@@ -3543,7 +3587,7 @@
                 <w:sz w:val="21"/>
                 <w:szCs w:val="21"/>
               </w:rPr>
-              <w:t xml:space="preserve">HandData (21 landmarks), GestureType (THUMB_UP, THUMB_DOWN, CLOSED_FIST, OPEN_PALM, NONE) and Command (VOLUME_UP, VOLUME_DOWN, PLAY, PAUSE, NONE).</w:t>
+              <w:t xml:space="preserve">Sends the Windows Play/Pause key with PyAutoGUI. The key is a toggle, so it tracks is_playing (True, False or unknown), ignores a command that would not change the state, and waits at least 1 s between keys.</w:t>
             </w:r>
           </w:p>
         </w:tc>
@@ -3557,6 +3601,110 @@
               <w:right w:val="single" w:color="BFBFBF" w:sz="4"/>
             </w:tcBorders>
             <w:shd w:fill="F2F6FA" w:color="auto" w:val="clear"/>
+            <w:tcMar>
+              <w:top w:type="dxa" w:w="80"/>
+              <w:left w:type="dxa" w:w="120"/>
+              <w:bottom w:type="dxa" w:w="80"/>
+              <w:right w:type="dxa" w:w="120"/>
+            </w:tcMar>
+            <w:vAlign w:val="center"/>
+          </w:tcPr>
+          <w:p>
+            <w:pPr>
+              <w:jc w:val="left"/>
+            </w:pPr>
+            <w:r>
+              <w:rPr>
+                <w:rFonts w:ascii="Calibri" w:cs="Calibri" w:eastAsia="Calibri" w:hAnsi="Calibri"/>
+                <w:b w:val="false"/>
+                <w:bCs w:val="false"/>
+                <w:sz w:val="21"/>
+                <w:szCs w:val="21"/>
+              </w:rPr>
+              <w:t xml:space="preserve">FR-06, FR-07, FR-12</w:t>
+            </w:r>
+          </w:p>
+        </w:tc>
+      </w:tr>
+      <w:tr>
+        <w:trPr>
+          <w:cantSplit/>
+        </w:trPr>
+        <w:tc>
+          <w:tcPr>
+            <w:tcW w:type="dxa" w:w="2100"/>
+            <w:tcBorders>
+              <w:top w:val="single" w:color="BFBFBF" w:sz="4"/>
+              <w:left w:val="single" w:color="BFBFBF" w:sz="4"/>
+              <w:bottom w:val="single" w:color="BFBFBF" w:sz="4"/>
+              <w:right w:val="single" w:color="BFBFBF" w:sz="4"/>
+            </w:tcBorders>
+            <w:tcMar>
+              <w:top w:type="dxa" w:w="80"/>
+              <w:left w:type="dxa" w:w="120"/>
+              <w:bottom w:type="dxa" w:w="80"/>
+              <w:right w:type="dxa" w:w="120"/>
+            </w:tcMar>
+            <w:vAlign w:val="center"/>
+          </w:tcPr>
+          <w:p>
+            <w:pPr>
+              <w:jc w:val="left"/>
+            </w:pPr>
+            <w:r>
+              <w:rPr>
+                <w:rFonts w:ascii="Calibri" w:cs="Calibri" w:eastAsia="Calibri" w:hAnsi="Calibri"/>
+                <w:b/>
+                <w:bCs/>
+                <w:sz w:val="21"/>
+                <w:szCs w:val="21"/>
+              </w:rPr>
+              <w:t xml:space="preserve">Shared Data Types</w:t>
+            </w:r>
+          </w:p>
+        </w:tc>
+        <w:tc>
+          <w:tcPr>
+            <w:tcW w:type="dxa" w:w="5126"/>
+            <w:tcBorders>
+              <w:top w:val="single" w:color="BFBFBF" w:sz="4"/>
+              <w:left w:val="single" w:color="BFBFBF" w:sz="4"/>
+              <w:bottom w:val="single" w:color="BFBFBF" w:sz="4"/>
+              <w:right w:val="single" w:color="BFBFBF" w:sz="4"/>
+            </w:tcBorders>
+            <w:tcMar>
+              <w:top w:type="dxa" w:w="80"/>
+              <w:left w:type="dxa" w:w="120"/>
+              <w:bottom w:type="dxa" w:w="80"/>
+              <w:right w:type="dxa" w:w="120"/>
+            </w:tcMar>
+            <w:vAlign w:val="center"/>
+          </w:tcPr>
+          <w:p>
+            <w:pPr>
+              <w:jc w:val="left"/>
+            </w:pPr>
+            <w:r>
+              <w:rPr>
+                <w:rFonts w:ascii="Calibri" w:cs="Calibri" w:eastAsia="Calibri" w:hAnsi="Calibri"/>
+                <w:b w:val="false"/>
+                <w:bCs w:val="false"/>
+                <w:sz w:val="21"/>
+                <w:szCs w:val="21"/>
+              </w:rPr>
+              <w:t xml:space="preserve">HandData (21 landmarks and the image aspect ratio), GestureType (THUMB_UP, THUMB_DOWN, CLOSED_FIST, OPEN_PALM, NONE) and Command (VOLUME_UP, VOLUME_DOWN, PLAY, PAUSE, NONE).</w:t>
+            </w:r>
+          </w:p>
+        </w:tc>
+        <w:tc>
+          <w:tcPr>
+            <w:tcW w:type="dxa" w:w="1800"/>
+            <w:tcBorders>
+              <w:top w:val="single" w:color="BFBFBF" w:sz="4"/>
+              <w:left w:val="single" w:color="BFBFBF" w:sz="4"/>
+              <w:bottom w:val="single" w:color="BFBFBF" w:sz="4"/>
+              <w:right w:val="single" w:color="BFBFBF" w:sz="4"/>
+            </w:tcBorders>
             <w:tcMar>
               <w:top w:type="dxa" w:w="80"/>
               <w:left w:type="dxa" w:w="120"/>
@@ -4119,7 +4267,7 @@
                 <w:sz w:val="21"/>
                 <w:szCs w:val="21"/>
               </w:rPr>
-              <w:t xml:space="preserve">Initial values: hold time about 0.5 s, cooldown about 1 s</w:t>
+              <w:t xml:space="preserve">Hold values counted in frames and tuned on real recordings: thumb 8, closed fist 6, open palm 10; motion window 0.2 s; volume repeat 0.3 s; Play/Pause at least 1 s apart</w:t>
             </w:r>
           </w:p>
         </w:tc>
@@ -4153,7 +4301,7 @@
                 <w:sz w:val="21"/>
                 <w:szCs w:val="21"/>
               </w:rPr>
-              <w:t xml:space="preserve">Starting values only. They will be tuned during Testing for accuracy and comfort.</w:t>
+              <w:t xml:space="preserve">The first guesses (hold time about 0.5 s, cooldown about 1 s) were replaced by measured values (Test Plan, Sections 6 and 7). Counting frames is simple to test; the wait grows when the FPS drops.</w:t>
             </w:r>
           </w:p>
         </w:tc>
@@ -4257,7 +4405,7 @@
                 <w:sz w:val="21"/>
                 <w:szCs w:val="21"/>
               </w:rPr>
-              <w:t xml:space="preserve">The Windows media key is a play/pause toggle. Remembering the state avoids pausing a video that Open palm should keep playing. Limitation: the state can be wrong if the user changes it manually.</w:t>
+              <w:t xml:space="preserve">The Windows media key is a play/pause toggle. Remembering the state avoids pausing a video that Open palm should keep playing. Limitation: the state can be wrong if the user changes the video by hand, so the window has Video state buttons to correct it.</w:t>
             </w:r>
           </w:p>
         </w:tc>
@@ -4469,6 +4617,639 @@
                 <w:szCs w:val="21"/>
               </w:rPr>
               <w:t xml:space="preserve">Makes future Custom Gestures and new modes easy to add (extensibility from the proposal).</w:t>
+            </w:r>
+          </w:p>
+        </w:tc>
+      </w:tr>
+      <w:tr>
+        <w:trPr>
+          <w:cantSplit/>
+        </w:trPr>
+        <w:tc>
+          <w:tcPr>
+            <w:tcW w:type="dxa" w:w="900"/>
+            <w:tcBorders>
+              <w:top w:val="single" w:color="BFBFBF" w:sz="4"/>
+              <w:left w:val="single" w:color="BFBFBF" w:sz="4"/>
+              <w:bottom w:val="single" w:color="BFBFBF" w:sz="4"/>
+              <w:right w:val="single" w:color="BFBFBF" w:sz="4"/>
+            </w:tcBorders>
+            <w:shd w:fill="F2F6FA" w:color="auto" w:val="clear"/>
+            <w:tcMar>
+              <w:top w:type="dxa" w:w="80"/>
+              <w:left w:type="dxa" w:w="120"/>
+              <w:bottom w:type="dxa" w:w="80"/>
+              <w:right w:type="dxa" w:w="120"/>
+            </w:tcMar>
+            <w:vAlign w:val="center"/>
+          </w:tcPr>
+          <w:p>
+            <w:pPr>
+              <w:jc w:val="left"/>
+            </w:pPr>
+            <w:r>
+              <w:rPr>
+                <w:rFonts w:ascii="Calibri" w:cs="Calibri" w:eastAsia="Calibri" w:hAnsi="Calibri"/>
+                <w:b/>
+                <w:bCs/>
+                <w:sz w:val="21"/>
+                <w:szCs w:val="21"/>
+              </w:rPr>
+              <w:t xml:space="preserve">D-08</w:t>
+            </w:r>
+          </w:p>
+        </w:tc>
+        <w:tc>
+          <w:tcPr>
+            <w:tcW w:type="dxa" w:w="3200"/>
+            <w:tcBorders>
+              <w:top w:val="single" w:color="BFBFBF" w:sz="4"/>
+              <w:left w:val="single" w:color="BFBFBF" w:sz="4"/>
+              <w:bottom w:val="single" w:color="BFBFBF" w:sz="4"/>
+              <w:right w:val="single" w:color="BFBFBF" w:sz="4"/>
+            </w:tcBorders>
+            <w:shd w:fill="F2F6FA" w:color="auto" w:val="clear"/>
+            <w:tcMar>
+              <w:top w:type="dxa" w:w="80"/>
+              <w:left w:type="dxa" w:w="120"/>
+              <w:bottom w:type="dxa" w:w="80"/>
+              <w:right w:type="dxa" w:w="120"/>
+            </w:tcMar>
+            <w:vAlign w:val="center"/>
+          </w:tcPr>
+          <w:p>
+            <w:pPr>
+              <w:jc w:val="left"/>
+            </w:pPr>
+            <w:r>
+              <w:rPr>
+                <w:rFonts w:ascii="Calibri" w:cs="Calibri" w:eastAsia="Calibri" w:hAnsi="Calibri"/>
+                <w:b w:val="false"/>
+                <w:bCs w:val="false"/>
+                <w:sz w:val="21"/>
+                <w:szCs w:val="21"/>
+              </w:rPr>
+              <w:t xml:space="preserve">MotionFilter: ignore gestures while the hand is moving</w:t>
+            </w:r>
+          </w:p>
+        </w:tc>
+        <w:tc>
+          <w:tcPr>
+            <w:tcW w:type="dxa" w:w="4926"/>
+            <w:tcBorders>
+              <w:top w:val="single" w:color="BFBFBF" w:sz="4"/>
+              <w:left w:val="single" w:color="BFBFBF" w:sz="4"/>
+              <w:bottom w:val="single" w:color="BFBFBF" w:sz="4"/>
+              <w:right w:val="single" w:color="BFBFBF" w:sz="4"/>
+            </w:tcBorders>
+            <w:shd w:fill="F2F6FA" w:color="auto" w:val="clear"/>
+            <w:tcMar>
+              <w:top w:type="dxa" w:w="80"/>
+              <w:left w:type="dxa" w:w="120"/>
+              <w:bottom w:type="dxa" w:w="80"/>
+              <w:right w:type="dxa" w:w="120"/>
+            </w:tcMar>
+            <w:vAlign w:val="center"/>
+          </w:tcPr>
+          <w:p>
+            <w:pPr>
+              <w:jc w:val="left"/>
+            </w:pPr>
+            <w:r>
+              <w:rPr>
+                <w:rFonts w:ascii="Calibri" w:cs="Calibri" w:eastAsia="Calibri" w:hAnsi="Calibri"/>
+                <w:b w:val="false"/>
+                <w:bCs w:val="false"/>
+                <w:sz w:val="21"/>
+                <w:szCs w:val="21"/>
+              </w:rPr>
+              <w:t xml:space="preserve">Testing showed that an open hand being raised looked like PLAY, and a closing hand passed through THUMB_DOWN. A gesture must come from a still hand.</w:t>
+            </w:r>
+          </w:p>
+        </w:tc>
+      </w:tr>
+      <w:tr>
+        <w:trPr>
+          <w:cantSplit/>
+        </w:trPr>
+        <w:tc>
+          <w:tcPr>
+            <w:tcW w:type="dxa" w:w="900"/>
+            <w:tcBorders>
+              <w:top w:val="single" w:color="BFBFBF" w:sz="4"/>
+              <w:left w:val="single" w:color="BFBFBF" w:sz="4"/>
+              <w:bottom w:val="single" w:color="BFBFBF" w:sz="4"/>
+              <w:right w:val="single" w:color="BFBFBF" w:sz="4"/>
+            </w:tcBorders>
+            <w:tcMar>
+              <w:top w:type="dxa" w:w="80"/>
+              <w:left w:type="dxa" w:w="120"/>
+              <w:bottom w:type="dxa" w:w="80"/>
+              <w:right w:type="dxa" w:w="120"/>
+            </w:tcMar>
+            <w:vAlign w:val="center"/>
+          </w:tcPr>
+          <w:p>
+            <w:pPr>
+              <w:jc w:val="left"/>
+            </w:pPr>
+            <w:r>
+              <w:rPr>
+                <w:rFonts w:ascii="Calibri" w:cs="Calibri" w:eastAsia="Calibri" w:hAnsi="Calibri"/>
+                <w:b/>
+                <w:bCs/>
+                <w:sz w:val="21"/>
+                <w:szCs w:val="21"/>
+              </w:rPr>
+              <w:t xml:space="preserve">D-09</w:t>
+            </w:r>
+          </w:p>
+        </w:tc>
+        <w:tc>
+          <w:tcPr>
+            <w:tcW w:type="dxa" w:w="3200"/>
+            <w:tcBorders>
+              <w:top w:val="single" w:color="BFBFBF" w:sz="4"/>
+              <w:left w:val="single" w:color="BFBFBF" w:sz="4"/>
+              <w:bottom w:val="single" w:color="BFBFBF" w:sz="4"/>
+              <w:right w:val="single" w:color="BFBFBF" w:sz="4"/>
+            </w:tcBorders>
+            <w:tcMar>
+              <w:top w:type="dxa" w:w="80"/>
+              <w:left w:type="dxa" w:w="120"/>
+              <w:bottom w:type="dxa" w:w="80"/>
+              <w:right w:type="dxa" w:w="120"/>
+            </w:tcMar>
+            <w:vAlign w:val="center"/>
+          </w:tcPr>
+          <w:p>
+            <w:pPr>
+              <w:jc w:val="left"/>
+            </w:pPr>
+            <w:r>
+              <w:rPr>
+                <w:rFonts w:ascii="Calibri" w:cs="Calibri" w:eastAsia="Calibri" w:hAnsi="Calibri"/>
+                <w:b w:val="false"/>
+                <w:bCs w:val="false"/>
+                <w:sz w:val="21"/>
+                <w:szCs w:val="21"/>
+              </w:rPr>
+              <w:t xml:space="preserve">Different hold per gesture; open palm (Play) is the longest</w:t>
+            </w:r>
+          </w:p>
+        </w:tc>
+        <w:tc>
+          <w:tcPr>
+            <w:tcW w:type="dxa" w:w="4926"/>
+            <w:tcBorders>
+              <w:top w:val="single" w:color="BFBFBF" w:sz="4"/>
+              <w:left w:val="single" w:color="BFBFBF" w:sz="4"/>
+              <w:bottom w:val="single" w:color="BFBFBF" w:sz="4"/>
+              <w:right w:val="single" w:color="BFBFBF" w:sz="4"/>
+            </w:tcBorders>
+            <w:tcMar>
+              <w:top w:type="dxa" w:w="80"/>
+              <w:left w:type="dxa" w:w="120"/>
+              <w:bottom w:type="dxa" w:w="80"/>
+              <w:right w:type="dxa" w:w="120"/>
+            </w:tcMar>
+            <w:vAlign w:val="center"/>
+          </w:tcPr>
+          <w:p>
+            <w:pPr>
+              <w:jc w:val="left"/>
+            </w:pPr>
+            <w:r>
+              <w:rPr>
+                <w:rFonts w:ascii="Calibri" w:cs="Calibri" w:eastAsia="Calibri" w:hAnsi="Calibri"/>
+                <w:b w:val="false"/>
+                <w:bCs w:val="false"/>
+                <w:sz w:val="21"/>
+                <w:szCs w:val="21"/>
+              </w:rPr>
+              <w:t xml:space="preserve">A wrong Play is more annoying than a wrong volume step. The fist hold was shortened to 6 frames because replaying a real recording raised the fist from 3/6 to 6/6 with no extra false triggers.</w:t>
+            </w:r>
+          </w:p>
+        </w:tc>
+      </w:tr>
+      <w:tr>
+        <w:trPr>
+          <w:cantSplit/>
+        </w:trPr>
+        <w:tc>
+          <w:tcPr>
+            <w:tcW w:type="dxa" w:w="900"/>
+            <w:tcBorders>
+              <w:top w:val="single" w:color="BFBFBF" w:sz="4"/>
+              <w:left w:val="single" w:color="BFBFBF" w:sz="4"/>
+              <w:bottom w:val="single" w:color="BFBFBF" w:sz="4"/>
+              <w:right w:val="single" w:color="BFBFBF" w:sz="4"/>
+            </w:tcBorders>
+            <w:shd w:fill="F2F6FA" w:color="auto" w:val="clear"/>
+            <w:tcMar>
+              <w:top w:type="dxa" w:w="80"/>
+              <w:left w:type="dxa" w:w="120"/>
+              <w:bottom w:type="dxa" w:w="80"/>
+              <w:right w:type="dxa" w:w="120"/>
+            </w:tcMar>
+            <w:vAlign w:val="center"/>
+          </w:tcPr>
+          <w:p>
+            <w:pPr>
+              <w:jc w:val="left"/>
+            </w:pPr>
+            <w:r>
+              <w:rPr>
+                <w:rFonts w:ascii="Calibri" w:cs="Calibri" w:eastAsia="Calibri" w:hAnsi="Calibri"/>
+                <w:b/>
+                <w:bCs/>
+                <w:sz w:val="21"/>
+                <w:szCs w:val="21"/>
+              </w:rPr>
+              <w:t xml:space="preserve">D-10</w:t>
+            </w:r>
+          </w:p>
+        </w:tc>
+        <w:tc>
+          <w:tcPr>
+            <w:tcW w:type="dxa" w:w="3200"/>
+            <w:tcBorders>
+              <w:top w:val="single" w:color="BFBFBF" w:sz="4"/>
+              <w:left w:val="single" w:color="BFBFBF" w:sz="4"/>
+              <w:bottom w:val="single" w:color="BFBFBF" w:sz="4"/>
+              <w:right w:val="single" w:color="BFBFBF" w:sz="4"/>
+            </w:tcBorders>
+            <w:shd w:fill="F2F6FA" w:color="auto" w:val="clear"/>
+            <w:tcMar>
+              <w:top w:type="dxa" w:w="80"/>
+              <w:left w:type="dxa" w:w="120"/>
+              <w:bottom w:type="dxa" w:w="80"/>
+              <w:right w:type="dxa" w:w="120"/>
+            </w:tcMar>
+            <w:vAlign w:val="center"/>
+          </w:tcPr>
+          <w:p>
+            <w:pPr>
+              <w:jc w:val="left"/>
+            </w:pPr>
+            <w:r>
+              <w:rPr>
+                <w:rFonts w:ascii="Calibri" w:cs="Calibri" w:eastAsia="Calibri" w:hAnsi="Calibri"/>
+                <w:b w:val="false"/>
+                <w:bCs w:val="false"/>
+                <w:sz w:val="21"/>
+                <w:szCs w:val="21"/>
+              </w:rPr>
+              <w:t xml:space="preserve">The frame loop uses after(0) followed by update_idletasks()</w:t>
+            </w:r>
+          </w:p>
+        </w:tc>
+        <w:tc>
+          <w:tcPr>
+            <w:tcW w:type="dxa" w:w="4926"/>
+            <w:tcBorders>
+              <w:top w:val="single" w:color="BFBFBF" w:sz="4"/>
+              <w:left w:val="single" w:color="BFBFBF" w:sz="4"/>
+              <w:bottom w:val="single" w:color="BFBFBF" w:sz="4"/>
+              <w:right w:val="single" w:color="BFBFBF" w:sz="4"/>
+            </w:tcBorders>
+            <w:shd w:fill="F2F6FA" w:color="auto" w:val="clear"/>
+            <w:tcMar>
+              <w:top w:type="dxa" w:w="80"/>
+              <w:left w:type="dxa" w:w="120"/>
+              <w:bottom w:type="dxa" w:w="80"/>
+              <w:right w:type="dxa" w:w="120"/>
+            </w:tcMar>
+            <w:vAlign w:val="center"/>
+          </w:tcPr>
+          <w:p>
+            <w:pPr>
+              <w:jc w:val="left"/>
+            </w:pPr>
+            <w:r>
+              <w:rPr>
+                <w:rFonts w:ascii="Calibri" w:cs="Calibri" w:eastAsia="Calibri" w:hAnsi="Calibri"/>
+                <w:b w:val="false"/>
+                <w:bCs w:val="false"/>
+                <w:sz w:val="21"/>
+                <w:szCs w:val="21"/>
+              </w:rPr>
+              <w:t xml:space="preserve">after(1) wasted about 15 ms per frame on Windows. A loop with no waiting left Tk no time to draw the window (found by testing), so update_idletasks() gives it that time. after_idle was rejected because it freezes the window.</w:t>
+            </w:r>
+          </w:p>
+        </w:tc>
+      </w:tr>
+      <w:tr>
+        <w:trPr>
+          <w:cantSplit/>
+        </w:trPr>
+        <w:tc>
+          <w:tcPr>
+            <w:tcW w:type="dxa" w:w="900"/>
+            <w:tcBorders>
+              <w:top w:val="single" w:color="BFBFBF" w:sz="4"/>
+              <w:left w:val="single" w:color="BFBFBF" w:sz="4"/>
+              <w:bottom w:val="single" w:color="BFBFBF" w:sz="4"/>
+              <w:right w:val="single" w:color="BFBFBF" w:sz="4"/>
+            </w:tcBorders>
+            <w:tcMar>
+              <w:top w:type="dxa" w:w="80"/>
+              <w:left w:type="dxa" w:w="120"/>
+              <w:bottom w:type="dxa" w:w="80"/>
+              <w:right w:type="dxa" w:w="120"/>
+            </w:tcMar>
+            <w:vAlign w:val="center"/>
+          </w:tcPr>
+          <w:p>
+            <w:pPr>
+              <w:jc w:val="left"/>
+            </w:pPr>
+            <w:r>
+              <w:rPr>
+                <w:rFonts w:ascii="Calibri" w:cs="Calibri" w:eastAsia="Calibri" w:hAnsi="Calibri"/>
+                <w:b/>
+                <w:bCs/>
+                <w:sz w:val="21"/>
+                <w:szCs w:val="21"/>
+              </w:rPr>
+              <w:t xml:space="preserve">D-11</w:t>
+            </w:r>
+          </w:p>
+        </w:tc>
+        <w:tc>
+          <w:tcPr>
+            <w:tcW w:type="dxa" w:w="3200"/>
+            <w:tcBorders>
+              <w:top w:val="single" w:color="BFBFBF" w:sz="4"/>
+              <w:left w:val="single" w:color="BFBFBF" w:sz="4"/>
+              <w:bottom w:val="single" w:color="BFBFBF" w:sz="4"/>
+              <w:right w:val="single" w:color="BFBFBF" w:sz="4"/>
+            </w:tcBorders>
+            <w:tcMar>
+              <w:top w:type="dxa" w:w="80"/>
+              <w:left w:type="dxa" w:w="120"/>
+              <w:bottom w:type="dxa" w:w="80"/>
+              <w:right w:type="dxa" w:w="120"/>
+            </w:tcMar>
+            <w:vAlign w:val="center"/>
+          </w:tcPr>
+          <w:p>
+            <w:pPr>
+              <w:jc w:val="left"/>
+            </w:pPr>
+            <w:r>
+              <w:rPr>
+                <w:rFonts w:ascii="Calibri" w:cs="Calibri" w:eastAsia="Calibri" w:hAnsi="Calibri"/>
+                <w:b w:val="false"/>
+                <w:bCs w:val="false"/>
+                <w:sz w:val="21"/>
+                <w:szCs w:val="21"/>
+              </w:rPr>
+              <w:t xml:space="preserve">Ask the camera for YUY2, 640x480, 30 FPS</w:t>
+            </w:r>
+          </w:p>
+        </w:tc>
+        <w:tc>
+          <w:tcPr>
+            <w:tcW w:type="dxa" w:w="4926"/>
+            <w:tcBorders>
+              <w:top w:val="single" w:color="BFBFBF" w:sz="4"/>
+              <w:left w:val="single" w:color="BFBFBF" w:sz="4"/>
+              <w:bottom w:val="single" w:color="BFBFBF" w:sz="4"/>
+              <w:right w:val="single" w:color="BFBFBF" w:sz="4"/>
+            </w:tcBorders>
+            <w:tcMar>
+              <w:top w:type="dxa" w:w="80"/>
+              <w:left w:type="dxa" w:w="120"/>
+              <w:bottom w:type="dxa" w:w="80"/>
+              <w:right w:type="dxa" w:w="120"/>
+            </w:tcMar>
+            <w:vAlign w:val="center"/>
+          </w:tcPr>
+          <w:p>
+            <w:pPr>
+              <w:jc w:val="left"/>
+            </w:pPr>
+            <w:r>
+              <w:rPr>
+                <w:rFonts w:ascii="Calibri" w:cs="Calibri" w:eastAsia="Calibri" w:hAnsi="Calibri"/>
+                <w:b w:val="false"/>
+                <w:bCs w:val="false"/>
+                <w:sz w:val="21"/>
+                <w:szCs w:val="21"/>
+              </w:rPr>
+              <w:t xml:space="preserve">Measured: the default camera mode ran at 10 FPS, this mode at 16.5 FPS.</w:t>
+            </w:r>
+          </w:p>
+        </w:tc>
+      </w:tr>
+      <w:tr>
+        <w:trPr>
+          <w:cantSplit/>
+        </w:trPr>
+        <w:tc>
+          <w:tcPr>
+            <w:tcW w:type="dxa" w:w="900"/>
+            <w:tcBorders>
+              <w:top w:val="single" w:color="BFBFBF" w:sz="4"/>
+              <w:left w:val="single" w:color="BFBFBF" w:sz="4"/>
+              <w:bottom w:val="single" w:color="BFBFBF" w:sz="4"/>
+              <w:right w:val="single" w:color="BFBFBF" w:sz="4"/>
+            </w:tcBorders>
+            <w:shd w:fill="F2F6FA" w:color="auto" w:val="clear"/>
+            <w:tcMar>
+              <w:top w:type="dxa" w:w="80"/>
+              <w:left w:type="dxa" w:w="120"/>
+              <w:bottom w:type="dxa" w:w="80"/>
+              <w:right w:type="dxa" w:w="120"/>
+            </w:tcMar>
+            <w:vAlign w:val="center"/>
+          </w:tcPr>
+          <w:p>
+            <w:pPr>
+              <w:jc w:val="left"/>
+            </w:pPr>
+            <w:r>
+              <w:rPr>
+                <w:rFonts w:ascii="Calibri" w:cs="Calibri" w:eastAsia="Calibri" w:hAnsi="Calibri"/>
+                <w:b/>
+                <w:bCs/>
+                <w:sz w:val="21"/>
+                <w:szCs w:val="21"/>
+              </w:rPr>
+              <w:t xml:space="preserve">D-12</w:t>
+            </w:r>
+          </w:p>
+        </w:tc>
+        <w:tc>
+          <w:tcPr>
+            <w:tcW w:type="dxa" w:w="3200"/>
+            <w:tcBorders>
+              <w:top w:val="single" w:color="BFBFBF" w:sz="4"/>
+              <w:left w:val="single" w:color="BFBFBF" w:sz="4"/>
+              <w:bottom w:val="single" w:color="BFBFBF" w:sz="4"/>
+              <w:right w:val="single" w:color="BFBFBF" w:sz="4"/>
+            </w:tcBorders>
+            <w:shd w:fill="F2F6FA" w:color="auto" w:val="clear"/>
+            <w:tcMar>
+              <w:top w:type="dxa" w:w="80"/>
+              <w:left w:type="dxa" w:w="120"/>
+              <w:bottom w:type="dxa" w:w="80"/>
+              <w:right w:type="dxa" w:w="120"/>
+            </w:tcMar>
+            <w:vAlign w:val="center"/>
+          </w:tcPr>
+          <w:p>
+            <w:pPr>
+              <w:jc w:val="left"/>
+            </w:pPr>
+            <w:r>
+              <w:rPr>
+                <w:rFonts w:ascii="Calibri" w:cs="Calibri" w:eastAsia="Calibri" w:hAnsi="Calibri"/>
+                <w:b w:val="false"/>
+                <w:bCs w:val="false"/>
+                <w:sz w:val="21"/>
+                <w:szCs w:val="21"/>
+              </w:rPr>
+              <w:t xml:space="preserve">Control is disabled when the program starts</w:t>
+            </w:r>
+          </w:p>
+        </w:tc>
+        <w:tc>
+          <w:tcPr>
+            <w:tcW w:type="dxa" w:w="4926"/>
+            <w:tcBorders>
+              <w:top w:val="single" w:color="BFBFBF" w:sz="4"/>
+              <w:left w:val="single" w:color="BFBFBF" w:sz="4"/>
+              <w:bottom w:val="single" w:color="BFBFBF" w:sz="4"/>
+              <w:right w:val="single" w:color="BFBFBF" w:sz="4"/>
+            </w:tcBorders>
+            <w:shd w:fill="F2F6FA" w:color="auto" w:val="clear"/>
+            <w:tcMar>
+              <w:top w:type="dxa" w:w="80"/>
+              <w:left w:type="dxa" w:w="120"/>
+              <w:bottom w:type="dxa" w:w="80"/>
+              <w:right w:type="dxa" w:w="120"/>
+            </w:tcMar>
+            <w:vAlign w:val="center"/>
+          </w:tcPr>
+          <w:p>
+            <w:pPr>
+              <w:jc w:val="left"/>
+            </w:pPr>
+            <w:r>
+              <w:rPr>
+                <w:rFonts w:ascii="Calibri" w:cs="Calibri" w:eastAsia="Calibri" w:hAnsi="Calibri"/>
+                <w:b w:val="false"/>
+                <w:bCs w:val="false"/>
+                <w:sz w:val="21"/>
+                <w:szCs w:val="21"/>
+              </w:rPr>
+              <w:t xml:space="preserve">Safe start: gestures are shown but nothing is changed until the user enables control (FR-08).</w:t>
+            </w:r>
+          </w:p>
+        </w:tc>
+      </w:tr>
+      <w:tr>
+        <w:trPr>
+          <w:cantSplit/>
+        </w:trPr>
+        <w:tc>
+          <w:tcPr>
+            <w:tcW w:type="dxa" w:w="900"/>
+            <w:tcBorders>
+              <w:top w:val="single" w:color="BFBFBF" w:sz="4"/>
+              <w:left w:val="single" w:color="BFBFBF" w:sz="4"/>
+              <w:bottom w:val="single" w:color="BFBFBF" w:sz="4"/>
+              <w:right w:val="single" w:color="BFBFBF" w:sz="4"/>
+            </w:tcBorders>
+            <w:tcMar>
+              <w:top w:type="dxa" w:w="80"/>
+              <w:left w:type="dxa" w:w="120"/>
+              <w:bottom w:type="dxa" w:w="80"/>
+              <w:right w:type="dxa" w:w="120"/>
+            </w:tcMar>
+            <w:vAlign w:val="center"/>
+          </w:tcPr>
+          <w:p>
+            <w:pPr>
+              <w:jc w:val="left"/>
+            </w:pPr>
+            <w:r>
+              <w:rPr>
+                <w:rFonts w:ascii="Calibri" w:cs="Calibri" w:eastAsia="Calibri" w:hAnsi="Calibri"/>
+                <w:b/>
+                <w:bCs/>
+                <w:sz w:val="21"/>
+                <w:szCs w:val="21"/>
+              </w:rPr>
+              <w:t xml:space="preserve">D-13</w:t>
+            </w:r>
+          </w:p>
+        </w:tc>
+        <w:tc>
+          <w:tcPr>
+            <w:tcW w:type="dxa" w:w="3200"/>
+            <w:tcBorders>
+              <w:top w:val="single" w:color="BFBFBF" w:sz="4"/>
+              <w:left w:val="single" w:color="BFBFBF" w:sz="4"/>
+              <w:bottom w:val="single" w:color="BFBFBF" w:sz="4"/>
+              <w:right w:val="single" w:color="BFBFBF" w:sz="4"/>
+            </w:tcBorders>
+            <w:tcMar>
+              <w:top w:type="dxa" w:w="80"/>
+              <w:left w:type="dxa" w:w="120"/>
+              <w:bottom w:type="dxa" w:w="80"/>
+              <w:right w:type="dxa" w:w="120"/>
+            </w:tcMar>
+            <w:vAlign w:val="center"/>
+          </w:tcPr>
+          <w:p>
+            <w:pPr>
+              <w:jc w:val="left"/>
+            </w:pPr>
+            <w:r>
+              <w:rPr>
+                <w:rFonts w:ascii="Calibri" w:cs="Calibri" w:eastAsia="Calibri" w:hAnsi="Calibri"/>
+                <w:b w:val="false"/>
+                <w:bCs w:val="false"/>
+                <w:sz w:val="21"/>
+                <w:szCs w:val="21"/>
+              </w:rPr>
+              <w:t xml:space="preserve">AppController contains no Tkinter code</w:t>
+            </w:r>
+          </w:p>
+        </w:tc>
+        <w:tc>
+          <w:tcPr>
+            <w:tcW w:type="dxa" w:w="4926"/>
+            <w:tcBorders>
+              <w:top w:val="single" w:color="BFBFBF" w:sz="4"/>
+              <w:left w:val="single" w:color="BFBFBF" w:sz="4"/>
+              <w:bottom w:val="single" w:color="BFBFBF" w:sz="4"/>
+              <w:right w:val="single" w:color="BFBFBF" w:sz="4"/>
+            </w:tcBorders>
+            <w:tcMar>
+              <w:top w:type="dxa" w:w="80"/>
+              <w:left w:type="dxa" w:w="120"/>
+              <w:bottom w:type="dxa" w:w="80"/>
+              <w:right w:type="dxa" w:w="120"/>
+            </w:tcMar>
+            <w:vAlign w:val="center"/>
+          </w:tcPr>
+          <w:p>
+            <w:pPr>
+              <w:jc w:val="left"/>
+            </w:pPr>
+            <w:r>
+              <w:rPr>
+                <w:rFonts w:ascii="Calibri" w:cs="Calibri" w:eastAsia="Calibri" w:hAnsi="Calibri"/>
+                <w:b w:val="false"/>
+                <w:bCs w:val="false"/>
+                <w:sz w:val="21"/>
+                <w:szCs w:val="21"/>
+              </w:rPr>
+              <w:t xml:space="preserve">The whole pipeline is tested with fake parts and no screen (21 tests), and the window can change without touching the logic (NFR-06).</w:t>
             </w:r>
           </w:p>
         </w:tc>
@@ -4557,6 +5338,21 @@
           <w:sz w:val="19"/>
           <w:szCs w:val="19"/>
         </w:rPr>
+        <w:t xml:space="preserve">  download_model.py            (downloads the hand model once)</w:t>
+      </w:r>
+    </w:p>
+    <w:p>
+      <w:pPr>
+        <w:keepNext/>
+        <w:shd w:fill="F2F2F2" w:color="auto" w:val="clear"/>
+        <w:spacing w:after="0" w:line="252"/>
+      </w:pPr>
+      <w:r>
+        <w:rPr>
+          <w:rFonts w:ascii="Consolas" w:cs="Consolas" w:eastAsia="Consolas" w:hAnsi="Consolas"/>
+          <w:sz w:val="19"/>
+          <w:szCs w:val="19"/>
+        </w:rPr>
         <w:t xml:space="preserve">  requirements.txt</w:t>
       </w:r>
     </w:p>
@@ -4587,6 +5383,36 @@
           <w:sz w:val="19"/>
           <w:szCs w:val="19"/>
         </w:rPr>
+        <w:t xml:space="preserve">  assets/                      (hand_landmarker.task, not stored in Git)</w:t>
+      </w:r>
+    </w:p>
+    <w:p>
+      <w:pPr>
+        <w:keepNext/>
+        <w:shd w:fill="F2F2F2" w:color="auto" w:val="clear"/>
+        <w:spacing w:after="0" w:line="252"/>
+      </w:pPr>
+      <w:r>
+        <w:rPr>
+          <w:rFonts w:ascii="Consolas" w:cs="Consolas" w:eastAsia="Consolas" w:hAnsi="Consolas"/>
+          <w:sz w:val="19"/>
+          <w:szCs w:val="19"/>
+        </w:rPr>
+        <w:t xml:space="preserve">  docs/                        (SRS, Use Cases, Design, Test Plan, diagrams)</w:t>
+      </w:r>
+    </w:p>
+    <w:p>
+      <w:pPr>
+        <w:keepNext/>
+        <w:shd w:fill="F2F2F2" w:color="auto" w:val="clear"/>
+        <w:spacing w:after="0" w:line="252"/>
+      </w:pPr>
+      <w:r>
+        <w:rPr>
+          <w:rFonts w:ascii="Consolas" w:cs="Consolas" w:eastAsia="Consolas" w:hAnsi="Consolas"/>
+          <w:sz w:val="19"/>
+          <w:szCs w:val="19"/>
+        </w:rPr>
         <w:t xml:space="preserve">  models/</w:t>
       </w:r>
     </w:p>
@@ -4692,6 +5518,21 @@
           <w:sz w:val="19"/>
           <w:szCs w:val="19"/>
         </w:rPr>
+        <w:t xml:space="preserve">    motion_filter.py</w:t>
+      </w:r>
+    </w:p>
+    <w:p>
+      <w:pPr>
+        <w:keepNext/>
+        <w:shd w:fill="F2F2F2" w:color="auto" w:val="clear"/>
+        <w:spacing w:after="0" w:line="252"/>
+      </w:pPr>
+      <w:r>
+        <w:rPr>
+          <w:rFonts w:ascii="Consolas" w:cs="Consolas" w:eastAsia="Consolas" w:hAnsi="Consolas"/>
+          <w:sz w:val="19"/>
+          <w:szCs w:val="19"/>
+        </w:rPr>
         <w:t xml:space="preserve">    gesture_stabilizer.py</w:t>
       </w:r>
     </w:p>
@@ -4827,9 +5668,1642 @@
           <w:sz w:val="19"/>
           <w:szCs w:val="19"/>
         </w:rPr>
-        <w:t xml:space="preserve">  tests/                       (test cases from the Testing phase)</w:t>
-      </w:r>
-    </w:p>
+        <w:t xml:space="preserve">  tests/                       (131 automated tests, fakes.py)</w:t>
+      </w:r>
+    </w:p>
+    <w:p>
+      <w:pPr>
+        <w:keepNext/>
+        <w:shd w:fill="F2F2F2" w:color="auto" w:val="clear"/>
+        <w:spacing w:after="0" w:line="252"/>
+      </w:pPr>
+      <w:r>
+        <w:rPr>
+          <w:rFonts w:ascii="Consolas" w:cs="Consolas" w:eastAsia="Consolas" w:hAnsi="Consolas"/>
+          <w:sz w:val="19"/>
+          <w:szCs w:val="19"/>
+        </w:rPr>
+        <w:t xml:space="preserve">  accuracy_test.py, measure_speed.py, measure_ui_speed.py,</w:t>
+      </w:r>
+    </w:p>
+    <w:p>
+      <w:pPr>
+        <w:keepNext/>
+        <w:shd w:fill="F2F2F2" w:color="auto" w:val="clear"/>
+        <w:spacing w:after="0" w:line="252"/>
+      </w:pPr>
+      <w:r>
+        <w:rPr>
+          <w:rFonts w:ascii="Consolas" w:cs="Consolas" w:eastAsia="Consolas" w:hAnsi="Consolas"/>
+          <w:sz w:val="19"/>
+          <w:szCs w:val="19"/>
+        </w:rPr>
+        <w:t xml:space="preserve">  try_camera_modes.py, calibrate_gestures.py, try_*.py</w:t>
+      </w:r>
+    </w:p>
+    <w:p>
+      <w:pPr>
+        <w:keepNext/>
+        <w:shd w:fill="F2F2F2" w:color="auto" w:val="clear"/>
+        <w:spacing w:after="0" w:line="252"/>
+      </w:pPr>
+      <w:r>
+        <w:rPr>
+          <w:rFonts w:ascii="Consolas" w:cs="Consolas" w:eastAsia="Consolas" w:hAnsi="Consolas"/>
+          <w:sz w:val="19"/>
+          <w:szCs w:val="19"/>
+        </w:rPr>
+        <w:t xml:space="preserve">                               (measurement and manual test tools)</w:t>
+      </w:r>
+    </w:p>
+    <w:p>
+      <w:pPr>
+        <w:pStyle w:val="Heading1"/>
+        <w:keepNext/>
+        <w:pBdr>
+          <w:bottom w:val="single" w:color="2E75B6" w:sz="8" w:space="4"/>
+        </w:pBdr>
+        <w:spacing w:after="160" w:before="360"/>
+      </w:pPr>
+      <w:r>
+        <w:rPr>
+          <w:rFonts w:ascii="Calibri" w:cs="Calibri" w:eastAsia="Calibri" w:hAnsi="Calibri"/>
+          <w:b/>
+          <w:bCs/>
+          <w:color w:val="1F3864"/>
+          <w:sz w:val="32"/>
+          <w:szCs w:val="32"/>
+        </w:rPr>
+        <w:t xml:space="preserve">9. Changes from the Initial Design (v1.0 to v1.1)</w:t>
+      </w:r>
+    </w:p>
+    <w:p>
+      <w:pPr>
+        <w:spacing w:after="120" w:line="276"/>
+      </w:pPr>
+      <w:r>
+        <w:rPr>
+          <w:rFonts w:ascii="Calibri" w:cs="Calibri" w:eastAsia="Calibri" w:hAnsi="Calibri"/>
+          <w:sz w:val="22"/>
+          <w:szCs w:val="22"/>
+        </w:rPr>
+        <w:t xml:space="preserve">The architecture (five layers, one class per job) did not change. The details below changed during implementation and testing.</w:t>
+      </w:r>
+    </w:p>
+    <w:tbl>
+      <w:tblPr>
+        <w:tblW w:type="dxa" w:w="9026"/>
+        <w:tblBorders>
+          <w:top w:val="single" w:color="auto" w:sz="4"/>
+          <w:left w:val="single" w:color="auto" w:sz="4"/>
+          <w:bottom w:val="single" w:color="auto" w:sz="4"/>
+          <w:right w:val="single" w:color="auto" w:sz="4"/>
+          <w:insideH w:val="single" w:color="auto" w:sz="4"/>
+          <w:insideV w:val="single" w:color="auto" w:sz="4"/>
+        </w:tblBorders>
+      </w:tblPr>
+      <w:tblGrid>
+        <w:gridCol w:w="1500"/>
+        <w:gridCol w:w="2300"/>
+        <w:gridCol w:w="3026"/>
+        <w:gridCol w:w="2200"/>
+      </w:tblGrid>
+      <w:tr>
+        <w:trPr>
+          <w:tblHeader/>
+        </w:trPr>
+        <w:tc>
+          <w:tcPr>
+            <w:tcW w:type="dxa" w:w="1500"/>
+            <w:tcBorders>
+              <w:top w:val="single" w:color="BFBFBF" w:sz="4"/>
+              <w:left w:val="single" w:color="BFBFBF" w:sz="4"/>
+              <w:bottom w:val="single" w:color="BFBFBF" w:sz="4"/>
+              <w:right w:val="single" w:color="BFBFBF" w:sz="4"/>
+            </w:tcBorders>
+            <w:shd w:fill="1F3864" w:color="auto" w:val="clear"/>
+            <w:tcMar>
+              <w:top w:type="dxa" w:w="80"/>
+              <w:left w:type="dxa" w:w="120"/>
+              <w:bottom w:type="dxa" w:w="80"/>
+              <w:right w:type="dxa" w:w="120"/>
+            </w:tcMar>
+            <w:vAlign w:val="center"/>
+          </w:tcPr>
+          <w:p>
+            <w:pPr>
+              <w:jc w:val="left"/>
+            </w:pPr>
+            <w:r>
+              <w:rPr>
+                <w:rFonts w:ascii="Calibri" w:cs="Calibri" w:eastAsia="Calibri" w:hAnsi="Calibri"/>
+                <w:b/>
+                <w:bCs/>
+                <w:color w:val="FFFFFF"/>
+                <w:sz w:val="21"/>
+                <w:szCs w:val="21"/>
+              </w:rPr>
+              <w:t xml:space="preserve">Part</w:t>
+            </w:r>
+          </w:p>
+        </w:tc>
+        <w:tc>
+          <w:tcPr>
+            <w:tcW w:type="dxa" w:w="2300"/>
+            <w:tcBorders>
+              <w:top w:val="single" w:color="BFBFBF" w:sz="4"/>
+              <w:left w:val="single" w:color="BFBFBF" w:sz="4"/>
+              <w:bottom w:val="single" w:color="BFBFBF" w:sz="4"/>
+              <w:right w:val="single" w:color="BFBFBF" w:sz="4"/>
+            </w:tcBorders>
+            <w:shd w:fill="1F3864" w:color="auto" w:val="clear"/>
+            <w:tcMar>
+              <w:top w:type="dxa" w:w="80"/>
+              <w:left w:type="dxa" w:w="120"/>
+              <w:bottom w:type="dxa" w:w="80"/>
+              <w:right w:type="dxa" w:w="120"/>
+            </w:tcMar>
+            <w:vAlign w:val="center"/>
+          </w:tcPr>
+          <w:p>
+            <w:pPr>
+              <w:jc w:val="left"/>
+            </w:pPr>
+            <w:r>
+              <w:rPr>
+                <w:rFonts w:ascii="Calibri" w:cs="Calibri" w:eastAsia="Calibri" w:hAnsi="Calibri"/>
+                <w:b/>
+                <w:bCs/>
+                <w:color w:val="FFFFFF"/>
+                <w:sz w:val="21"/>
+                <w:szCs w:val="21"/>
+              </w:rPr>
+              <w:t xml:space="preserve">Design v1.0</w:t>
+            </w:r>
+          </w:p>
+        </w:tc>
+        <w:tc>
+          <w:tcPr>
+            <w:tcW w:type="dxa" w:w="3026"/>
+            <w:tcBorders>
+              <w:top w:val="single" w:color="BFBFBF" w:sz="4"/>
+              <w:left w:val="single" w:color="BFBFBF" w:sz="4"/>
+              <w:bottom w:val="single" w:color="BFBFBF" w:sz="4"/>
+              <w:right w:val="single" w:color="BFBFBF" w:sz="4"/>
+            </w:tcBorders>
+            <w:shd w:fill="1F3864" w:color="auto" w:val="clear"/>
+            <w:tcMar>
+              <w:top w:type="dxa" w:w="80"/>
+              <w:left w:type="dxa" w:w="120"/>
+              <w:bottom w:type="dxa" w:w="80"/>
+              <w:right w:type="dxa" w:w="120"/>
+            </w:tcMar>
+            <w:vAlign w:val="center"/>
+          </w:tcPr>
+          <w:p>
+            <w:pPr>
+              <w:jc w:val="left"/>
+            </w:pPr>
+            <w:r>
+              <w:rPr>
+                <w:rFonts w:ascii="Calibri" w:cs="Calibri" w:eastAsia="Calibri" w:hAnsi="Calibri"/>
+                <w:b/>
+                <w:bCs/>
+                <w:color w:val="FFFFFF"/>
+                <w:sz w:val="21"/>
+                <w:szCs w:val="21"/>
+              </w:rPr>
+              <w:t xml:space="preserve">As built (v1.1)</w:t>
+            </w:r>
+          </w:p>
+        </w:tc>
+        <w:tc>
+          <w:tcPr>
+            <w:tcW w:type="dxa" w:w="2200"/>
+            <w:tcBorders>
+              <w:top w:val="single" w:color="BFBFBF" w:sz="4"/>
+              <w:left w:val="single" w:color="BFBFBF" w:sz="4"/>
+              <w:bottom w:val="single" w:color="BFBFBF" w:sz="4"/>
+              <w:right w:val="single" w:color="BFBFBF" w:sz="4"/>
+            </w:tcBorders>
+            <w:shd w:fill="1F3864" w:color="auto" w:val="clear"/>
+            <w:tcMar>
+              <w:top w:type="dxa" w:w="80"/>
+              <w:left w:type="dxa" w:w="120"/>
+              <w:bottom w:type="dxa" w:w="80"/>
+              <w:right w:type="dxa" w:w="120"/>
+            </w:tcMar>
+            <w:vAlign w:val="center"/>
+          </w:tcPr>
+          <w:p>
+            <w:pPr>
+              <w:jc w:val="left"/>
+            </w:pPr>
+            <w:r>
+              <w:rPr>
+                <w:rFonts w:ascii="Calibri" w:cs="Calibri" w:eastAsia="Calibri" w:hAnsi="Calibri"/>
+                <w:b/>
+                <w:bCs/>
+                <w:color w:val="FFFFFF"/>
+                <w:sz w:val="21"/>
+                <w:szCs w:val="21"/>
+              </w:rPr>
+              <w:t xml:space="preserve">Reason</w:t>
+            </w:r>
+          </w:p>
+        </w:tc>
+      </w:tr>
+      <w:tr>
+        <w:trPr>
+          <w:cantSplit/>
+        </w:trPr>
+        <w:tc>
+          <w:tcPr>
+            <w:tcW w:type="dxa" w:w="1500"/>
+            <w:tcBorders>
+              <w:top w:val="single" w:color="BFBFBF" w:sz="4"/>
+              <w:left w:val="single" w:color="BFBFBF" w:sz="4"/>
+              <w:bottom w:val="single" w:color="BFBFBF" w:sz="4"/>
+              <w:right w:val="single" w:color="BFBFBF" w:sz="4"/>
+            </w:tcBorders>
+            <w:tcMar>
+              <w:top w:type="dxa" w:w="80"/>
+              <w:left w:type="dxa" w:w="120"/>
+              <w:bottom w:type="dxa" w:w="80"/>
+              <w:right w:type="dxa" w:w="120"/>
+            </w:tcMar>
+            <w:vAlign w:val="center"/>
+          </w:tcPr>
+          <w:p>
+            <w:pPr>
+              <w:jc w:val="left"/>
+            </w:pPr>
+            <w:r>
+              <w:rPr>
+                <w:rFonts w:ascii="Calibri" w:cs="Calibri" w:eastAsia="Calibri" w:hAnsi="Calibri"/>
+                <w:b/>
+                <w:bCs/>
+                <w:sz w:val="21"/>
+                <w:szCs w:val="21"/>
+              </w:rPr>
+              <w:t xml:space="preserve">GestureStabilizer</w:t>
+            </w:r>
+          </w:p>
+        </w:tc>
+        <w:tc>
+          <w:tcPr>
+            <w:tcW w:type="dxa" w:w="2300"/>
+            <w:tcBorders>
+              <w:top w:val="single" w:color="BFBFBF" w:sz="4"/>
+              <w:left w:val="single" w:color="BFBFBF" w:sz="4"/>
+              <w:bottom w:val="single" w:color="BFBFBF" w:sz="4"/>
+              <w:right w:val="single" w:color="BFBFBF" w:sz="4"/>
+            </w:tcBorders>
+            <w:tcMar>
+              <w:top w:type="dxa" w:w="80"/>
+              <w:left w:type="dxa" w:w="120"/>
+              <w:bottom w:type="dxa" w:w="80"/>
+              <w:right w:type="dxa" w:w="120"/>
+            </w:tcMar>
+            <w:vAlign w:val="center"/>
+          </w:tcPr>
+          <w:p>
+            <w:pPr>
+              <w:jc w:val="left"/>
+            </w:pPr>
+            <w:r>
+              <w:rPr>
+                <w:rFonts w:ascii="Calibri" w:cs="Calibri" w:eastAsia="Calibri" w:hAnsi="Calibri"/>
+                <w:b w:val="false"/>
+                <w:bCs w:val="false"/>
+                <w:sz w:val="21"/>
+                <w:szCs w:val="21"/>
+              </w:rPr>
+              <w:t xml:space="preserve">hold_time (seconds) and cooldown inside the stabilizer</w:t>
+            </w:r>
+          </w:p>
+        </w:tc>
+        <w:tc>
+          <w:tcPr>
+            <w:tcW w:type="dxa" w:w="3026"/>
+            <w:tcBorders>
+              <w:top w:val="single" w:color="BFBFBF" w:sz="4"/>
+              <w:left w:val="single" w:color="BFBFBF" w:sz="4"/>
+              <w:bottom w:val="single" w:color="BFBFBF" w:sz="4"/>
+              <w:right w:val="single" w:color="BFBFBF" w:sz="4"/>
+            </w:tcBorders>
+            <w:tcMar>
+              <w:top w:type="dxa" w:w="80"/>
+              <w:left w:type="dxa" w:w="120"/>
+              <w:bottom w:type="dxa" w:w="80"/>
+              <w:right w:type="dxa" w:w="120"/>
+            </w:tcMar>
+            <w:vAlign w:val="center"/>
+          </w:tcPr>
+          <w:p>
+            <w:pPr>
+              <w:jc w:val="left"/>
+            </w:pPr>
+            <w:r>
+              <w:rPr>
+                <w:rFonts w:ascii="Calibri" w:cs="Calibri" w:eastAsia="Calibri" w:hAnsi="Calibri"/>
+                <w:b w:val="false"/>
+                <w:bCs w:val="false"/>
+                <w:sz w:val="21"/>
+                <w:szCs w:val="21"/>
+              </w:rPr>
+              <w:t xml:space="preserve">Hold counted in frames per gesture; cooldown moved to CommandMapper (volume repeat 0.3 s) and MediaController (1 s between keys)</w:t>
+            </w:r>
+          </w:p>
+        </w:tc>
+        <w:tc>
+          <w:tcPr>
+            <w:tcW w:type="dxa" w:w="2200"/>
+            <w:tcBorders>
+              <w:top w:val="single" w:color="BFBFBF" w:sz="4"/>
+              <w:left w:val="single" w:color="BFBFBF" w:sz="4"/>
+              <w:bottom w:val="single" w:color="BFBFBF" w:sz="4"/>
+              <w:right w:val="single" w:color="BFBFBF" w:sz="4"/>
+            </w:tcBorders>
+            <w:tcMar>
+              <w:top w:type="dxa" w:w="80"/>
+              <w:left w:type="dxa" w:w="120"/>
+              <w:bottom w:type="dxa" w:w="80"/>
+              <w:right w:type="dxa" w:w="120"/>
+            </w:tcMar>
+            <w:vAlign w:val="center"/>
+          </w:tcPr>
+          <w:p>
+            <w:pPr>
+              <w:jc w:val="left"/>
+            </w:pPr>
+            <w:r>
+              <w:rPr>
+                <w:rFonts w:ascii="Calibri" w:cs="Calibri" w:eastAsia="Calibri" w:hAnsi="Calibri"/>
+                <w:b w:val="false"/>
+                <w:bCs w:val="false"/>
+                <w:sz w:val="21"/>
+                <w:szCs w:val="21"/>
+              </w:rPr>
+              <w:t xml:space="preserve">Easier to test; tuned on real recordings (D-04, D-09).</w:t>
+            </w:r>
+          </w:p>
+        </w:tc>
+      </w:tr>
+      <w:tr>
+        <w:trPr>
+          <w:cantSplit/>
+        </w:trPr>
+        <w:tc>
+          <w:tcPr>
+            <w:tcW w:type="dxa" w:w="1500"/>
+            <w:tcBorders>
+              <w:top w:val="single" w:color="BFBFBF" w:sz="4"/>
+              <w:left w:val="single" w:color="BFBFBF" w:sz="4"/>
+              <w:bottom w:val="single" w:color="BFBFBF" w:sz="4"/>
+              <w:right w:val="single" w:color="BFBFBF" w:sz="4"/>
+            </w:tcBorders>
+            <w:shd w:fill="F2F6FA" w:color="auto" w:val="clear"/>
+            <w:tcMar>
+              <w:top w:type="dxa" w:w="80"/>
+              <w:left w:type="dxa" w:w="120"/>
+              <w:bottom w:type="dxa" w:w="80"/>
+              <w:right w:type="dxa" w:w="120"/>
+            </w:tcMar>
+            <w:vAlign w:val="center"/>
+          </w:tcPr>
+          <w:p>
+            <w:pPr>
+              <w:jc w:val="left"/>
+            </w:pPr>
+            <w:r>
+              <w:rPr>
+                <w:rFonts w:ascii="Calibri" w:cs="Calibri" w:eastAsia="Calibri" w:hAnsi="Calibri"/>
+                <w:b/>
+                <w:bCs/>
+                <w:sz w:val="21"/>
+                <w:szCs w:val="21"/>
+              </w:rPr>
+              <w:t xml:space="preserve">MotionFilter</w:t>
+            </w:r>
+          </w:p>
+        </w:tc>
+        <w:tc>
+          <w:tcPr>
+            <w:tcW w:type="dxa" w:w="2300"/>
+            <w:tcBorders>
+              <w:top w:val="single" w:color="BFBFBF" w:sz="4"/>
+              <w:left w:val="single" w:color="BFBFBF" w:sz="4"/>
+              <w:bottom w:val="single" w:color="BFBFBF" w:sz="4"/>
+              <w:right w:val="single" w:color="BFBFBF" w:sz="4"/>
+            </w:tcBorders>
+            <w:shd w:fill="F2F6FA" w:color="auto" w:val="clear"/>
+            <w:tcMar>
+              <w:top w:type="dxa" w:w="80"/>
+              <w:left w:type="dxa" w:w="120"/>
+              <w:bottom w:type="dxa" w:w="80"/>
+              <w:right w:type="dxa" w:w="120"/>
+            </w:tcMar>
+            <w:vAlign w:val="center"/>
+          </w:tcPr>
+          <w:p>
+            <w:pPr>
+              <w:jc w:val="left"/>
+            </w:pPr>
+            <w:r>
+              <w:rPr>
+                <w:rFonts w:ascii="Calibri" w:cs="Calibri" w:eastAsia="Calibri" w:hAnsi="Calibri"/>
+                <w:b w:val="false"/>
+                <w:bCs w:val="false"/>
+                <w:sz w:val="21"/>
+                <w:szCs w:val="21"/>
+              </w:rPr>
+              <w:t xml:space="preserve">Not in the design</w:t>
+            </w:r>
+          </w:p>
+        </w:tc>
+        <w:tc>
+          <w:tcPr>
+            <w:tcW w:type="dxa" w:w="3026"/>
+            <w:tcBorders>
+              <w:top w:val="single" w:color="BFBFBF" w:sz="4"/>
+              <w:left w:val="single" w:color="BFBFBF" w:sz="4"/>
+              <w:bottom w:val="single" w:color="BFBFBF" w:sz="4"/>
+              <w:right w:val="single" w:color="BFBFBF" w:sz="4"/>
+            </w:tcBorders>
+            <w:shd w:fill="F2F6FA" w:color="auto" w:val="clear"/>
+            <w:tcMar>
+              <w:top w:type="dxa" w:w="80"/>
+              <w:left w:type="dxa" w:w="120"/>
+              <w:bottom w:type="dxa" w:w="80"/>
+              <w:right w:type="dxa" w:w="120"/>
+            </w:tcMar>
+            <w:vAlign w:val="center"/>
+          </w:tcPr>
+          <w:p>
+            <w:pPr>
+              <w:jc w:val="left"/>
+            </w:pPr>
+            <w:r>
+              <w:rPr>
+                <w:rFonts w:ascii="Calibri" w:cs="Calibri" w:eastAsia="Calibri" w:hAnsi="Calibri"/>
+                <w:b w:val="false"/>
+                <w:bCs w:val="false"/>
+                <w:sz w:val="21"/>
+                <w:szCs w:val="21"/>
+              </w:rPr>
+              <w:t xml:space="preserve">New class in the Recognition layer</w:t>
+            </w:r>
+          </w:p>
+        </w:tc>
+        <w:tc>
+          <w:tcPr>
+            <w:tcW w:type="dxa" w:w="2200"/>
+            <w:tcBorders>
+              <w:top w:val="single" w:color="BFBFBF" w:sz="4"/>
+              <w:left w:val="single" w:color="BFBFBF" w:sz="4"/>
+              <w:bottom w:val="single" w:color="BFBFBF" w:sz="4"/>
+              <w:right w:val="single" w:color="BFBFBF" w:sz="4"/>
+            </w:tcBorders>
+            <w:shd w:fill="F2F6FA" w:color="auto" w:val="clear"/>
+            <w:tcMar>
+              <w:top w:type="dxa" w:w="80"/>
+              <w:left w:type="dxa" w:w="120"/>
+              <w:bottom w:type="dxa" w:w="80"/>
+              <w:right w:type="dxa" w:w="120"/>
+            </w:tcMar>
+            <w:vAlign w:val="center"/>
+          </w:tcPr>
+          <w:p>
+            <w:pPr>
+              <w:jc w:val="left"/>
+            </w:pPr>
+            <w:r>
+              <w:rPr>
+                <w:rFonts w:ascii="Calibri" w:cs="Calibri" w:eastAsia="Calibri" w:hAnsi="Calibri"/>
+                <w:b w:val="false"/>
+                <w:bCs w:val="false"/>
+                <w:sz w:val="21"/>
+                <w:szCs w:val="21"/>
+              </w:rPr>
+              <w:t xml:space="preserve">Stops raising or closing the hand from being read as a gesture (D-08).</w:t>
+            </w:r>
+          </w:p>
+        </w:tc>
+      </w:tr>
+      <w:tr>
+        <w:trPr>
+          <w:cantSplit/>
+        </w:trPr>
+        <w:tc>
+          <w:tcPr>
+            <w:tcW w:type="dxa" w:w="1500"/>
+            <w:tcBorders>
+              <w:top w:val="single" w:color="BFBFBF" w:sz="4"/>
+              <w:left w:val="single" w:color="BFBFBF" w:sz="4"/>
+              <w:bottom w:val="single" w:color="BFBFBF" w:sz="4"/>
+              <w:right w:val="single" w:color="BFBFBF" w:sz="4"/>
+            </w:tcBorders>
+            <w:tcMar>
+              <w:top w:type="dxa" w:w="80"/>
+              <w:left w:type="dxa" w:w="120"/>
+              <w:bottom w:type="dxa" w:w="80"/>
+              <w:right w:type="dxa" w:w="120"/>
+            </w:tcMar>
+            <w:vAlign w:val="center"/>
+          </w:tcPr>
+          <w:p>
+            <w:pPr>
+              <w:jc w:val="left"/>
+            </w:pPr>
+            <w:r>
+              <w:rPr>
+                <w:rFonts w:ascii="Calibri" w:cs="Calibri" w:eastAsia="Calibri" w:hAnsi="Calibri"/>
+                <w:b/>
+                <w:bCs/>
+                <w:sz w:val="21"/>
+                <w:szCs w:val="21"/>
+              </w:rPr>
+              <w:t xml:space="preserve">MainWindow</w:t>
+            </w:r>
+          </w:p>
+        </w:tc>
+        <w:tc>
+          <w:tcPr>
+            <w:tcW w:type="dxa" w:w="2300"/>
+            <w:tcBorders>
+              <w:top w:val="single" w:color="BFBFBF" w:sz="4"/>
+              <w:left w:val="single" w:color="BFBFBF" w:sz="4"/>
+              <w:bottom w:val="single" w:color="BFBFBF" w:sz="4"/>
+              <w:right w:val="single" w:color="BFBFBF" w:sz="4"/>
+            </w:tcBorders>
+            <w:tcMar>
+              <w:top w:type="dxa" w:w="80"/>
+              <w:left w:type="dxa" w:w="120"/>
+              <w:bottom w:type="dxa" w:w="80"/>
+              <w:right w:type="dxa" w:w="120"/>
+            </w:tcMar>
+            <w:vAlign w:val="center"/>
+          </w:tcPr>
+          <w:p>
+            <w:pPr>
+              <w:jc w:val="left"/>
+            </w:pPr>
+            <w:r>
+              <w:rPr>
+                <w:rFonts w:ascii="Calibri" w:cs="Calibri" w:eastAsia="Calibri" w:hAnsi="Calibri"/>
+                <w:b w:val="false"/>
+                <w:bCs w:val="false"/>
+                <w:sz w:val="21"/>
+                <w:szCs w:val="21"/>
+              </w:rPr>
+              <w:t xml:space="preserve">Start/Stop Camera and Enable buttons</w:t>
+            </w:r>
+          </w:p>
+        </w:tc>
+        <w:tc>
+          <w:tcPr>
+            <w:tcW w:type="dxa" w:w="3026"/>
+            <w:tcBorders>
+              <w:top w:val="single" w:color="BFBFBF" w:sz="4"/>
+              <w:left w:val="single" w:color="BFBFBF" w:sz="4"/>
+              <w:bottom w:val="single" w:color="BFBFBF" w:sz="4"/>
+              <w:right w:val="single" w:color="BFBFBF" w:sz="4"/>
+            </w:tcBorders>
+            <w:tcMar>
+              <w:top w:type="dxa" w:w="80"/>
+              <w:left w:type="dxa" w:w="120"/>
+              <w:bottom w:type="dxa" w:w="80"/>
+              <w:right w:type="dxa" w:w="120"/>
+            </w:tcMar>
+            <w:vAlign w:val="center"/>
+          </w:tcPr>
+          <w:p>
+            <w:pPr>
+              <w:jc w:val="left"/>
+            </w:pPr>
+            <w:r>
+              <w:rPr>
+                <w:rFonts w:ascii="Calibri" w:cs="Calibri" w:eastAsia="Calibri" w:hAnsi="Calibri"/>
+                <w:b w:val="false"/>
+                <w:bCs w:val="false"/>
+                <w:sz w:val="21"/>
+                <w:szCs w:val="21"/>
+              </w:rPr>
+              <w:t xml:space="preserve">Camera starts at launch; Retry camera, Quit, Enable/Disable (Space) and Video state buttons</w:t>
+            </w:r>
+          </w:p>
+        </w:tc>
+        <w:tc>
+          <w:tcPr>
+            <w:tcW w:type="dxa" w:w="2200"/>
+            <w:tcBorders>
+              <w:top w:val="single" w:color="BFBFBF" w:sz="4"/>
+              <w:left w:val="single" w:color="BFBFBF" w:sz="4"/>
+              <w:bottom w:val="single" w:color="BFBFBF" w:sz="4"/>
+              <w:right w:val="single" w:color="BFBFBF" w:sz="4"/>
+            </w:tcBorders>
+            <w:tcMar>
+              <w:top w:type="dxa" w:w="80"/>
+              <w:left w:type="dxa" w:w="120"/>
+              <w:bottom w:type="dxa" w:w="80"/>
+              <w:right w:type="dxa" w:w="120"/>
+            </w:tcMar>
+            <w:vAlign w:val="center"/>
+          </w:tcPr>
+          <w:p>
+            <w:pPr>
+              <w:jc w:val="left"/>
+            </w:pPr>
+            <w:r>
+              <w:rPr>
+                <w:rFonts w:ascii="Calibri" w:cs="Calibri" w:eastAsia="Calibri" w:hAnsi="Calibri"/>
+                <w:b w:val="false"/>
+                <w:bCs w:val="false"/>
+                <w:sz w:val="21"/>
+                <w:szCs w:val="21"/>
+              </w:rPr>
+              <w:t xml:space="preserve">Simpler for the user. FR-01 is therefore only partly met (no Stop button), see the Test Plan.</w:t>
+            </w:r>
+          </w:p>
+        </w:tc>
+      </w:tr>
+      <w:tr>
+        <w:trPr>
+          <w:cantSplit/>
+        </w:trPr>
+        <w:tc>
+          <w:tcPr>
+            <w:tcW w:type="dxa" w:w="1500"/>
+            <w:tcBorders>
+              <w:top w:val="single" w:color="BFBFBF" w:sz="4"/>
+              <w:left w:val="single" w:color="BFBFBF" w:sz="4"/>
+              <w:bottom w:val="single" w:color="BFBFBF" w:sz="4"/>
+              <w:right w:val="single" w:color="BFBFBF" w:sz="4"/>
+            </w:tcBorders>
+            <w:shd w:fill="F2F6FA" w:color="auto" w:val="clear"/>
+            <w:tcMar>
+              <w:top w:type="dxa" w:w="80"/>
+              <w:left w:type="dxa" w:w="120"/>
+              <w:bottom w:type="dxa" w:w="80"/>
+              <w:right w:type="dxa" w:w="120"/>
+            </w:tcMar>
+            <w:vAlign w:val="center"/>
+          </w:tcPr>
+          <w:p>
+            <w:pPr>
+              <w:jc w:val="left"/>
+            </w:pPr>
+            <w:r>
+              <w:rPr>
+                <w:rFonts w:ascii="Calibri" w:cs="Calibri" w:eastAsia="Calibri" w:hAnsi="Calibri"/>
+                <w:b/>
+                <w:bCs/>
+                <w:sz w:val="21"/>
+                <w:szCs w:val="21"/>
+              </w:rPr>
+              <w:t xml:space="preserve">AppController</w:t>
+            </w:r>
+          </w:p>
+        </w:tc>
+        <w:tc>
+          <w:tcPr>
+            <w:tcW w:type="dxa" w:w="2300"/>
+            <w:tcBorders>
+              <w:top w:val="single" w:color="BFBFBF" w:sz="4"/>
+              <w:left w:val="single" w:color="BFBFBF" w:sz="4"/>
+              <w:bottom w:val="single" w:color="BFBFBF" w:sz="4"/>
+              <w:right w:val="single" w:color="BFBFBF" w:sz="4"/>
+            </w:tcBorders>
+            <w:shd w:fill="F2F6FA" w:color="auto" w:val="clear"/>
+            <w:tcMar>
+              <w:top w:type="dxa" w:w="80"/>
+              <w:left w:type="dxa" w:w="120"/>
+              <w:bottom w:type="dxa" w:w="80"/>
+              <w:right w:type="dxa" w:w="120"/>
+            </w:tcMar>
+            <w:vAlign w:val="center"/>
+          </w:tcPr>
+          <w:p>
+            <w:pPr>
+              <w:jc w:val="left"/>
+            </w:pPr>
+            <w:r>
+              <w:rPr>
+                <w:rFonts w:ascii="Calibri" w:cs="Calibri" w:eastAsia="Calibri" w:hAnsi="Calibri"/>
+                <w:b w:val="false"/>
+                <w:bCs w:val="false"/>
+                <w:sz w:val="21"/>
+                <w:szCs w:val="21"/>
+              </w:rPr>
+              <w:t xml:space="preserve">camera_running, control_enabled, start_camera(), stop_camera(), set_control()</w:t>
+            </w:r>
+          </w:p>
+        </w:tc>
+        <w:tc>
+          <w:tcPr>
+            <w:tcW w:type="dxa" w:w="3026"/>
+            <w:tcBorders>
+              <w:top w:val="single" w:color="BFBFBF" w:sz="4"/>
+              <w:left w:val="single" w:color="BFBFBF" w:sz="4"/>
+              <w:bottom w:val="single" w:color="BFBFBF" w:sz="4"/>
+              <w:right w:val="single" w:color="BFBFBF" w:sz="4"/>
+            </w:tcBorders>
+            <w:shd w:fill="F2F6FA" w:color="auto" w:val="clear"/>
+            <w:tcMar>
+              <w:top w:type="dxa" w:w="80"/>
+              <w:left w:type="dxa" w:w="120"/>
+              <w:bottom w:type="dxa" w:w="80"/>
+              <w:right w:type="dxa" w:w="120"/>
+            </w:tcMar>
+            <w:vAlign w:val="center"/>
+          </w:tcPr>
+          <w:p>
+            <w:pPr>
+              <w:jc w:val="left"/>
+            </w:pPr>
+            <w:r>
+              <w:rPr>
+                <w:rFonts w:ascii="Calibri" w:cs="Calibri" w:eastAsia="Calibri" w:hAnsi="Calibri"/>
+                <w:b w:val="false"/>
+                <w:bCs w:val="false"/>
+                <w:sz w:val="21"/>
+                <w:szCs w:val="21"/>
+              </w:rPr>
+              <w:t xml:space="preserve">running, enabled, start(), stop(), set_enabled(); process_frame() returns a FrameResult; control is off at start</w:t>
+            </w:r>
+          </w:p>
+        </w:tc>
+        <w:tc>
+          <w:tcPr>
+            <w:tcW w:type="dxa" w:w="2200"/>
+            <w:tcBorders>
+              <w:top w:val="single" w:color="BFBFBF" w:sz="4"/>
+              <w:left w:val="single" w:color="BFBFBF" w:sz="4"/>
+              <w:bottom w:val="single" w:color="BFBFBF" w:sz="4"/>
+              <w:right w:val="single" w:color="BFBFBF" w:sz="4"/>
+            </w:tcBorders>
+            <w:shd w:fill="F2F6FA" w:color="auto" w:val="clear"/>
+            <w:tcMar>
+              <w:top w:type="dxa" w:w="80"/>
+              <w:left w:type="dxa" w:w="120"/>
+              <w:bottom w:type="dxa" w:w="80"/>
+              <w:right w:type="dxa" w:w="120"/>
+            </w:tcMar>
+            <w:vAlign w:val="center"/>
+          </w:tcPr>
+          <w:p>
+            <w:pPr>
+              <w:jc w:val="left"/>
+            </w:pPr>
+            <w:r>
+              <w:rPr>
+                <w:rFonts w:ascii="Calibri" w:cs="Calibri" w:eastAsia="Calibri" w:hAnsi="Calibri"/>
+                <w:b w:val="false"/>
+                <w:bCs w:val="false"/>
+                <w:sz w:val="21"/>
+                <w:szCs w:val="21"/>
+              </w:rPr>
+              <w:t xml:space="preserve">The window shows everything from one FrameResult; safe start (D-12).</w:t>
+            </w:r>
+          </w:p>
+        </w:tc>
+      </w:tr>
+      <w:tr>
+        <w:trPr>
+          <w:cantSplit/>
+        </w:trPr>
+        <w:tc>
+          <w:tcPr>
+            <w:tcW w:type="dxa" w:w="1500"/>
+            <w:tcBorders>
+              <w:top w:val="single" w:color="BFBFBF" w:sz="4"/>
+              <w:left w:val="single" w:color="BFBFBF" w:sz="4"/>
+              <w:bottom w:val="single" w:color="BFBFBF" w:sz="4"/>
+              <w:right w:val="single" w:color="BFBFBF" w:sz="4"/>
+            </w:tcBorders>
+            <w:tcMar>
+              <w:top w:type="dxa" w:w="80"/>
+              <w:left w:type="dxa" w:w="120"/>
+              <w:bottom w:type="dxa" w:w="80"/>
+              <w:right w:type="dxa" w:w="120"/>
+            </w:tcMar>
+            <w:vAlign w:val="center"/>
+          </w:tcPr>
+          <w:p>
+            <w:pPr>
+              <w:jc w:val="left"/>
+            </w:pPr>
+            <w:r>
+              <w:rPr>
+                <w:rFonts w:ascii="Calibri" w:cs="Calibri" w:eastAsia="Calibri" w:hAnsi="Calibri"/>
+                <w:b/>
+                <w:bCs/>
+                <w:sz w:val="21"/>
+                <w:szCs w:val="21"/>
+              </w:rPr>
+              <w:t xml:space="preserve">HandDetector</w:t>
+            </w:r>
+          </w:p>
+        </w:tc>
+        <w:tc>
+          <w:tcPr>
+            <w:tcW w:type="dxa" w:w="2300"/>
+            <w:tcBorders>
+              <w:top w:val="single" w:color="BFBFBF" w:sz="4"/>
+              <w:left w:val="single" w:color="BFBFBF" w:sz="4"/>
+              <w:bottom w:val="single" w:color="BFBFBF" w:sz="4"/>
+              <w:right w:val="single" w:color="BFBFBF" w:sz="4"/>
+            </w:tcBorders>
+            <w:tcMar>
+              <w:top w:type="dxa" w:w="80"/>
+              <w:left w:type="dxa" w:w="120"/>
+              <w:bottom w:type="dxa" w:w="80"/>
+              <w:right w:type="dxa" w:w="120"/>
+            </w:tcMar>
+            <w:vAlign w:val="center"/>
+          </w:tcPr>
+          <w:p>
+            <w:pPr>
+              <w:jc w:val="left"/>
+            </w:pPr>
+            <w:r>
+              <w:rPr>
+                <w:rFonts w:ascii="Calibri" w:cs="Calibri" w:eastAsia="Calibri" w:hAnsi="Calibri"/>
+                <w:b w:val="false"/>
+                <w:bCs w:val="false"/>
+                <w:sz w:val="21"/>
+                <w:szCs w:val="21"/>
+              </w:rPr>
+              <w:t xml:space="preserve">MediaPipe "hands" solution</w:t>
+            </w:r>
+          </w:p>
+        </w:tc>
+        <w:tc>
+          <w:tcPr>
+            <w:tcW w:type="dxa" w:w="3026"/>
+            <w:tcBorders>
+              <w:top w:val="single" w:color="BFBFBF" w:sz="4"/>
+              <w:left w:val="single" w:color="BFBFBF" w:sz="4"/>
+              <w:bottom w:val="single" w:color="BFBFBF" w:sz="4"/>
+              <w:right w:val="single" w:color="BFBFBF" w:sz="4"/>
+            </w:tcBorders>
+            <w:tcMar>
+              <w:top w:type="dxa" w:w="80"/>
+              <w:left w:type="dxa" w:w="120"/>
+              <w:bottom w:type="dxa" w:w="80"/>
+              <w:right w:type="dxa" w:w="120"/>
+            </w:tcMar>
+            <w:vAlign w:val="center"/>
+          </w:tcPr>
+          <w:p>
+            <w:pPr>
+              <w:jc w:val="left"/>
+            </w:pPr>
+            <w:r>
+              <w:rPr>
+                <w:rFonts w:ascii="Calibri" w:cs="Calibri" w:eastAsia="Calibri" w:hAnsi="Calibri"/>
+                <w:b w:val="false"/>
+                <w:bCs w:val="false"/>
+                <w:sz w:val="21"/>
+                <w:szCs w:val="21"/>
+              </w:rPr>
+              <w:t xml:space="preserve">MediaPipe HandLandmarker (Tasks API) in video mode with a model file; close() added</w:t>
+            </w:r>
+          </w:p>
+        </w:tc>
+        <w:tc>
+          <w:tcPr>
+            <w:tcW w:type="dxa" w:w="2200"/>
+            <w:tcBorders>
+              <w:top w:val="single" w:color="BFBFBF" w:sz="4"/>
+              <w:left w:val="single" w:color="BFBFBF" w:sz="4"/>
+              <w:bottom w:val="single" w:color="BFBFBF" w:sz="4"/>
+              <w:right w:val="single" w:color="BFBFBF" w:sz="4"/>
+            </w:tcBorders>
+            <w:tcMar>
+              <w:top w:type="dxa" w:w="80"/>
+              <w:left w:type="dxa" w:w="120"/>
+              <w:bottom w:type="dxa" w:w="80"/>
+              <w:right w:type="dxa" w:w="120"/>
+            </w:tcMar>
+            <w:vAlign w:val="center"/>
+          </w:tcPr>
+          <w:p>
+            <w:pPr>
+              <w:jc w:val="left"/>
+            </w:pPr>
+            <w:r>
+              <w:rPr>
+                <w:rFonts w:ascii="Calibri" w:cs="Calibri" w:eastAsia="Calibri" w:hAnsi="Calibri"/>
+                <w:b w:val="false"/>
+                <w:bCs w:val="false"/>
+                <w:sz w:val="21"/>
+                <w:szCs w:val="21"/>
+              </w:rPr>
+              <w:t xml:space="preserve">The Tasks API is the one provided by the installed MediaPipe version. The model is downloaded once by download_model.py.</w:t>
+            </w:r>
+          </w:p>
+        </w:tc>
+      </w:tr>
+      <w:tr>
+        <w:trPr>
+          <w:cantSplit/>
+        </w:trPr>
+        <w:tc>
+          <w:tcPr>
+            <w:tcW w:type="dxa" w:w="1500"/>
+            <w:tcBorders>
+              <w:top w:val="single" w:color="BFBFBF" w:sz="4"/>
+              <w:left w:val="single" w:color="BFBFBF" w:sz="4"/>
+              <w:bottom w:val="single" w:color="BFBFBF" w:sz="4"/>
+              <w:right w:val="single" w:color="BFBFBF" w:sz="4"/>
+            </w:tcBorders>
+            <w:shd w:fill="F2F6FA" w:color="auto" w:val="clear"/>
+            <w:tcMar>
+              <w:top w:type="dxa" w:w="80"/>
+              <w:left w:type="dxa" w:w="120"/>
+              <w:bottom w:type="dxa" w:w="80"/>
+              <w:right w:type="dxa" w:w="120"/>
+            </w:tcMar>
+            <w:vAlign w:val="center"/>
+          </w:tcPr>
+          <w:p>
+            <w:pPr>
+              <w:jc w:val="left"/>
+            </w:pPr>
+            <w:r>
+              <w:rPr>
+                <w:rFonts w:ascii="Calibri" w:cs="Calibri" w:eastAsia="Calibri" w:hAnsi="Calibri"/>
+                <w:b/>
+                <w:bCs/>
+                <w:sz w:val="21"/>
+                <w:szCs w:val="21"/>
+              </w:rPr>
+              <w:t xml:space="preserve">CameraManager</w:t>
+            </w:r>
+          </w:p>
+        </w:tc>
+        <w:tc>
+          <w:tcPr>
+            <w:tcW w:type="dxa" w:w="2300"/>
+            <w:tcBorders>
+              <w:top w:val="single" w:color="BFBFBF" w:sz="4"/>
+              <w:left w:val="single" w:color="BFBFBF" w:sz="4"/>
+              <w:bottom w:val="single" w:color="BFBFBF" w:sz="4"/>
+              <w:right w:val="single" w:color="BFBFBF" w:sz="4"/>
+            </w:tcBorders>
+            <w:shd w:fill="F2F6FA" w:color="auto" w:val="clear"/>
+            <w:tcMar>
+              <w:top w:type="dxa" w:w="80"/>
+              <w:left w:type="dxa" w:w="120"/>
+              <w:bottom w:type="dxa" w:w="80"/>
+              <w:right w:type="dxa" w:w="120"/>
+            </w:tcMar>
+            <w:vAlign w:val="center"/>
+          </w:tcPr>
+          <w:p>
+            <w:pPr>
+              <w:jc w:val="left"/>
+            </w:pPr>
+            <w:r>
+              <w:rPr>
+                <w:rFonts w:ascii="Calibri" w:cs="Calibri" w:eastAsia="Calibri" w:hAnsi="Calibri"/>
+                <w:b w:val="false"/>
+                <w:bCs w:val="false"/>
+                <w:sz w:val="21"/>
+                <w:szCs w:val="21"/>
+              </w:rPr>
+              <w:t xml:space="preserve">Open, read, release</w:t>
+            </w:r>
+          </w:p>
+        </w:tc>
+        <w:tc>
+          <w:tcPr>
+            <w:tcW w:type="dxa" w:w="3026"/>
+            <w:tcBorders>
+              <w:top w:val="single" w:color="BFBFBF" w:sz="4"/>
+              <w:left w:val="single" w:color="BFBFBF" w:sz="4"/>
+              <w:bottom w:val="single" w:color="BFBFBF" w:sz="4"/>
+              <w:right w:val="single" w:color="BFBFBF" w:sz="4"/>
+            </w:tcBorders>
+            <w:shd w:fill="F2F6FA" w:color="auto" w:val="clear"/>
+            <w:tcMar>
+              <w:top w:type="dxa" w:w="80"/>
+              <w:left w:type="dxa" w:w="120"/>
+              <w:bottom w:type="dxa" w:w="80"/>
+              <w:right w:type="dxa" w:w="120"/>
+            </w:tcMar>
+            <w:vAlign w:val="center"/>
+          </w:tcPr>
+          <w:p>
+            <w:pPr>
+              <w:jc w:val="left"/>
+            </w:pPr>
+            <w:r>
+              <w:rPr>
+                <w:rFonts w:ascii="Calibri" w:cs="Calibri" w:eastAsia="Calibri" w:hAnsi="Calibri"/>
+                <w:b w:val="false"/>
+                <w:bCs w:val="false"/>
+                <w:sz w:val="21"/>
+                <w:szCs w:val="21"/>
+              </w:rPr>
+              <w:t xml:space="preserve">Also asks for YUY2, 640x480, 30 FPS</w:t>
+            </w:r>
+          </w:p>
+        </w:tc>
+        <w:tc>
+          <w:tcPr>
+            <w:tcW w:type="dxa" w:w="2200"/>
+            <w:tcBorders>
+              <w:top w:val="single" w:color="BFBFBF" w:sz="4"/>
+              <w:left w:val="single" w:color="BFBFBF" w:sz="4"/>
+              <w:bottom w:val="single" w:color="BFBFBF" w:sz="4"/>
+              <w:right w:val="single" w:color="BFBFBF" w:sz="4"/>
+            </w:tcBorders>
+            <w:shd w:fill="F2F6FA" w:color="auto" w:val="clear"/>
+            <w:tcMar>
+              <w:top w:type="dxa" w:w="80"/>
+              <w:left w:type="dxa" w:w="120"/>
+              <w:bottom w:type="dxa" w:w="80"/>
+              <w:right w:type="dxa" w:w="120"/>
+            </w:tcMar>
+            <w:vAlign w:val="center"/>
+          </w:tcPr>
+          <w:p>
+            <w:pPr>
+              <w:jc w:val="left"/>
+            </w:pPr>
+            <w:r>
+              <w:rPr>
+                <w:rFonts w:ascii="Calibri" w:cs="Calibri" w:eastAsia="Calibri" w:hAnsi="Calibri"/>
+                <w:b w:val="false"/>
+                <w:bCs w:val="false"/>
+                <w:sz w:val="21"/>
+                <w:szCs w:val="21"/>
+              </w:rPr>
+              <w:t xml:space="preserve">Measured 16.5 FPS instead of 10 (D-11).</w:t>
+            </w:r>
+          </w:p>
+        </w:tc>
+      </w:tr>
+      <w:tr>
+        <w:trPr>
+          <w:cantSplit/>
+        </w:trPr>
+        <w:tc>
+          <w:tcPr>
+            <w:tcW w:type="dxa" w:w="1500"/>
+            <w:tcBorders>
+              <w:top w:val="single" w:color="BFBFBF" w:sz="4"/>
+              <w:left w:val="single" w:color="BFBFBF" w:sz="4"/>
+              <w:bottom w:val="single" w:color="BFBFBF" w:sz="4"/>
+              <w:right w:val="single" w:color="BFBFBF" w:sz="4"/>
+            </w:tcBorders>
+            <w:tcMar>
+              <w:top w:type="dxa" w:w="80"/>
+              <w:left w:type="dxa" w:w="120"/>
+              <w:bottom w:type="dxa" w:w="80"/>
+              <w:right w:type="dxa" w:w="120"/>
+            </w:tcMar>
+            <w:vAlign w:val="center"/>
+          </w:tcPr>
+          <w:p>
+            <w:pPr>
+              <w:jc w:val="left"/>
+            </w:pPr>
+            <w:r>
+              <w:rPr>
+                <w:rFonts w:ascii="Calibri" w:cs="Calibri" w:eastAsia="Calibri" w:hAnsi="Calibri"/>
+                <w:b/>
+                <w:bCs/>
+                <w:sz w:val="21"/>
+                <w:szCs w:val="21"/>
+              </w:rPr>
+              <w:t xml:space="preserve">VolumeController</w:t>
+            </w:r>
+          </w:p>
+        </w:tc>
+        <w:tc>
+          <w:tcPr>
+            <w:tcW w:type="dxa" w:w="2300"/>
+            <w:tcBorders>
+              <w:top w:val="single" w:color="BFBFBF" w:sz="4"/>
+              <w:left w:val="single" w:color="BFBFBF" w:sz="4"/>
+              <w:bottom w:val="single" w:color="BFBFBF" w:sz="4"/>
+              <w:right w:val="single" w:color="BFBFBF" w:sz="4"/>
+            </w:tcBorders>
+            <w:tcMar>
+              <w:top w:type="dxa" w:w="80"/>
+              <w:left w:type="dxa" w:w="120"/>
+              <w:bottom w:type="dxa" w:w="80"/>
+              <w:right w:type="dxa" w:w="120"/>
+            </w:tcMar>
+            <w:vAlign w:val="center"/>
+          </w:tcPr>
+          <w:p>
+            <w:pPr>
+              <w:jc w:val="left"/>
+            </w:pPr>
+            <w:r>
+              <w:rPr>
+                <w:rFonts w:ascii="Calibri" w:cs="Calibri" w:eastAsia="Calibri" w:hAnsi="Calibri"/>
+                <w:b w:val="false"/>
+                <w:bCs w:val="false"/>
+                <w:sz w:val="21"/>
+                <w:szCs w:val="21"/>
+              </w:rPr>
+              <w:t xml:space="preserve">increase(step), decrease(step), get_level(): int</w:t>
+            </w:r>
+          </w:p>
+        </w:tc>
+        <w:tc>
+          <w:tcPr>
+            <w:tcW w:type="dxa" w:w="3026"/>
+            <w:tcBorders>
+              <w:top w:val="single" w:color="BFBFBF" w:sz="4"/>
+              <w:left w:val="single" w:color="BFBFBF" w:sz="4"/>
+              <w:bottom w:val="single" w:color="BFBFBF" w:sz="4"/>
+              <w:right w:val="single" w:color="BFBFBF" w:sz="4"/>
+            </w:tcBorders>
+            <w:tcMar>
+              <w:top w:type="dxa" w:w="80"/>
+              <w:left w:type="dxa" w:w="120"/>
+              <w:bottom w:type="dxa" w:w="80"/>
+              <w:right w:type="dxa" w:w="120"/>
+            </w:tcMar>
+            <w:vAlign w:val="center"/>
+          </w:tcPr>
+          <w:p>
+            <w:pPr>
+              <w:jc w:val="left"/>
+            </w:pPr>
+            <w:r>
+              <w:rPr>
+                <w:rFonts w:ascii="Calibri" w:cs="Calibri" w:eastAsia="Calibri" w:hAnsi="Calibri"/>
+                <w:b w:val="false"/>
+                <w:bCs w:val="false"/>
+                <w:sz w:val="21"/>
+                <w:szCs w:val="21"/>
+              </w:rPr>
+              <w:t xml:space="preserve">volume_up(), volume_down(), get_volume(): float (0.0 to 1.0); returns None on failure</w:t>
+            </w:r>
+          </w:p>
+        </w:tc>
+        <w:tc>
+          <w:tcPr>
+            <w:tcW w:type="dxa" w:w="2200"/>
+            <w:tcBorders>
+              <w:top w:val="single" w:color="BFBFBF" w:sz="4"/>
+              <w:left w:val="single" w:color="BFBFBF" w:sz="4"/>
+              <w:bottom w:val="single" w:color="BFBFBF" w:sz="4"/>
+              <w:right w:val="single" w:color="BFBFBF" w:sz="4"/>
+            </w:tcBorders>
+            <w:tcMar>
+              <w:top w:type="dxa" w:w="80"/>
+              <w:left w:type="dxa" w:w="120"/>
+              <w:bottom w:type="dxa" w:w="80"/>
+              <w:right w:type="dxa" w:w="120"/>
+            </w:tcMar>
+            <w:vAlign w:val="center"/>
+          </w:tcPr>
+          <w:p>
+            <w:pPr>
+              <w:jc w:val="left"/>
+            </w:pPr>
+            <w:r>
+              <w:rPr>
+                <w:rFonts w:ascii="Calibri" w:cs="Calibri" w:eastAsia="Calibri" w:hAnsi="Calibri"/>
+                <w:b w:val="false"/>
+                <w:bCs w:val="false"/>
+                <w:sz w:val="21"/>
+                <w:szCs w:val="21"/>
+              </w:rPr>
+              <w:t xml:space="preserve">Never crashes without an audio device (NFR-07).</w:t>
+            </w:r>
+          </w:p>
+        </w:tc>
+      </w:tr>
+      <w:tr>
+        <w:trPr>
+          <w:cantSplit/>
+        </w:trPr>
+        <w:tc>
+          <w:tcPr>
+            <w:tcW w:type="dxa" w:w="1500"/>
+            <w:tcBorders>
+              <w:top w:val="single" w:color="BFBFBF" w:sz="4"/>
+              <w:left w:val="single" w:color="BFBFBF" w:sz="4"/>
+              <w:bottom w:val="single" w:color="BFBFBF" w:sz="4"/>
+              <w:right w:val="single" w:color="BFBFBF" w:sz="4"/>
+            </w:tcBorders>
+            <w:shd w:fill="F2F6FA" w:color="auto" w:val="clear"/>
+            <w:tcMar>
+              <w:top w:type="dxa" w:w="80"/>
+              <w:left w:type="dxa" w:w="120"/>
+              <w:bottom w:type="dxa" w:w="80"/>
+              <w:right w:type="dxa" w:w="120"/>
+            </w:tcMar>
+            <w:vAlign w:val="center"/>
+          </w:tcPr>
+          <w:p>
+            <w:pPr>
+              <w:jc w:val="left"/>
+            </w:pPr>
+            <w:r>
+              <w:rPr>
+                <w:rFonts w:ascii="Calibri" w:cs="Calibri" w:eastAsia="Calibri" w:hAnsi="Calibri"/>
+                <w:b/>
+                <w:bCs/>
+                <w:sz w:val="21"/>
+                <w:szCs w:val="21"/>
+              </w:rPr>
+              <w:t xml:space="preserve">MediaController</w:t>
+            </w:r>
+          </w:p>
+        </w:tc>
+        <w:tc>
+          <w:tcPr>
+            <w:tcW w:type="dxa" w:w="2300"/>
+            <w:tcBorders>
+              <w:top w:val="single" w:color="BFBFBF" w:sz="4"/>
+              <w:left w:val="single" w:color="BFBFBF" w:sz="4"/>
+              <w:bottom w:val="single" w:color="BFBFBF" w:sz="4"/>
+              <w:right w:val="single" w:color="BFBFBF" w:sz="4"/>
+            </w:tcBorders>
+            <w:shd w:fill="F2F6FA" w:color="auto" w:val="clear"/>
+            <w:tcMar>
+              <w:top w:type="dxa" w:w="80"/>
+              <w:left w:type="dxa" w:w="120"/>
+              <w:bottom w:type="dxa" w:w="80"/>
+              <w:right w:type="dxa" w:w="120"/>
+            </w:tcMar>
+            <w:vAlign w:val="center"/>
+          </w:tcPr>
+          <w:p>
+            <w:pPr>
+              <w:jc w:val="left"/>
+            </w:pPr>
+            <w:r>
+              <w:rPr>
+                <w:rFonts w:ascii="Calibri" w:cs="Calibri" w:eastAsia="Calibri" w:hAnsi="Calibri"/>
+                <w:b w:val="false"/>
+                <w:bCs w:val="false"/>
+                <w:sz w:val="21"/>
+                <w:szCs w:val="21"/>
+              </w:rPr>
+              <w:t xml:space="preserve">is_playing: bool, play(), pause()</w:t>
+            </w:r>
+          </w:p>
+        </w:tc>
+        <w:tc>
+          <w:tcPr>
+            <w:tcW w:type="dxa" w:w="3026"/>
+            <w:tcBorders>
+              <w:top w:val="single" w:color="BFBFBF" w:sz="4"/>
+              <w:left w:val="single" w:color="BFBFBF" w:sz="4"/>
+              <w:bottom w:val="single" w:color="BFBFBF" w:sz="4"/>
+              <w:right w:val="single" w:color="BFBFBF" w:sz="4"/>
+            </w:tcBorders>
+            <w:shd w:fill="F2F6FA" w:color="auto" w:val="clear"/>
+            <w:tcMar>
+              <w:top w:type="dxa" w:w="80"/>
+              <w:left w:type="dxa" w:w="120"/>
+              <w:bottom w:type="dxa" w:w="80"/>
+              <w:right w:type="dxa" w:w="120"/>
+            </w:tcMar>
+            <w:vAlign w:val="center"/>
+          </w:tcPr>
+          <w:p>
+            <w:pPr>
+              <w:jc w:val="left"/>
+            </w:pPr>
+            <w:r>
+              <w:rPr>
+                <w:rFonts w:ascii="Calibri" w:cs="Calibri" w:eastAsia="Calibri" w:hAnsi="Calibri"/>
+                <w:b w:val="false"/>
+                <w:bCs w:val="false"/>
+                <w:sz w:val="21"/>
+                <w:szCs w:val="21"/>
+              </w:rPr>
+              <w:t xml:space="preserve">is_playing is True, False or unknown; execute(command); 1 s minimum between keys</w:t>
+            </w:r>
+          </w:p>
+        </w:tc>
+        <w:tc>
+          <w:tcPr>
+            <w:tcW w:type="dxa" w:w="2200"/>
+            <w:tcBorders>
+              <w:top w:val="single" w:color="BFBFBF" w:sz="4"/>
+              <w:left w:val="single" w:color="BFBFBF" w:sz="4"/>
+              <w:bottom w:val="single" w:color="BFBFBF" w:sz="4"/>
+              <w:right w:val="single" w:color="BFBFBF" w:sz="4"/>
+            </w:tcBorders>
+            <w:shd w:fill="F2F6FA" w:color="auto" w:val="clear"/>
+            <w:tcMar>
+              <w:top w:type="dxa" w:w="80"/>
+              <w:left w:type="dxa" w:w="120"/>
+              <w:bottom w:type="dxa" w:w="80"/>
+              <w:right w:type="dxa" w:w="120"/>
+            </w:tcMar>
+            <w:vAlign w:val="center"/>
+          </w:tcPr>
+          <w:p>
+            <w:pPr>
+              <w:jc w:val="left"/>
+            </w:pPr>
+            <w:r>
+              <w:rPr>
+                <w:rFonts w:ascii="Calibri" w:cs="Calibri" w:eastAsia="Calibri" w:hAnsi="Calibri"/>
+                <w:b w:val="false"/>
+                <w:bCs w:val="false"/>
+                <w:sz w:val="21"/>
+                <w:szCs w:val="21"/>
+              </w:rPr>
+              <w:t xml:space="preserve">The media key is a toggle (D-05).</w:t>
+            </w:r>
+          </w:p>
+        </w:tc>
+      </w:tr>
+      <w:tr>
+        <w:trPr>
+          <w:cantSplit/>
+        </w:trPr>
+        <w:tc>
+          <w:tcPr>
+            <w:tcW w:type="dxa" w:w="1500"/>
+            <w:tcBorders>
+              <w:top w:val="single" w:color="BFBFBF" w:sz="4"/>
+              <w:left w:val="single" w:color="BFBFBF" w:sz="4"/>
+              <w:bottom w:val="single" w:color="BFBFBF" w:sz="4"/>
+              <w:right w:val="single" w:color="BFBFBF" w:sz="4"/>
+            </w:tcBorders>
+            <w:tcMar>
+              <w:top w:type="dxa" w:w="80"/>
+              <w:left w:type="dxa" w:w="120"/>
+              <w:bottom w:type="dxa" w:w="80"/>
+              <w:right w:type="dxa" w:w="120"/>
+            </w:tcMar>
+            <w:vAlign w:val="center"/>
+          </w:tcPr>
+          <w:p>
+            <w:pPr>
+              <w:jc w:val="left"/>
+            </w:pPr>
+            <w:r>
+              <w:rPr>
+                <w:rFonts w:ascii="Calibri" w:cs="Calibri" w:eastAsia="Calibri" w:hAnsi="Calibri"/>
+                <w:b/>
+                <w:bCs/>
+                <w:sz w:val="21"/>
+                <w:szCs w:val="21"/>
+              </w:rPr>
+              <w:t xml:space="preserve">GestureRecognizer</w:t>
+            </w:r>
+          </w:p>
+        </w:tc>
+        <w:tc>
+          <w:tcPr>
+            <w:tcW w:type="dxa" w:w="2300"/>
+            <w:tcBorders>
+              <w:top w:val="single" w:color="BFBFBF" w:sz="4"/>
+              <w:left w:val="single" w:color="BFBFBF" w:sz="4"/>
+              <w:bottom w:val="single" w:color="BFBFBF" w:sz="4"/>
+              <w:right w:val="single" w:color="BFBFBF" w:sz="4"/>
+            </w:tcBorders>
+            <w:tcMar>
+              <w:top w:type="dxa" w:w="80"/>
+              <w:left w:type="dxa" w:w="120"/>
+              <w:bottom w:type="dxa" w:w="80"/>
+              <w:right w:type="dxa" w:w="120"/>
+            </w:tcMar>
+            <w:vAlign w:val="center"/>
+          </w:tcPr>
+          <w:p>
+            <w:pPr>
+              <w:jc w:val="left"/>
+            </w:pPr>
+            <w:r>
+              <w:rPr>
+                <w:rFonts w:ascii="Calibri" w:cs="Calibri" w:eastAsia="Calibri" w:hAnsi="Calibri"/>
+                <w:b w:val="false"/>
+                <w:bCs w:val="false"/>
+                <w:sz w:val="21"/>
+                <w:szCs w:val="21"/>
+              </w:rPr>
+              <w:t xml:space="preserve">recognize(hand)</w:t>
+            </w:r>
+          </w:p>
+        </w:tc>
+        <w:tc>
+          <w:tcPr>
+            <w:tcW w:type="dxa" w:w="3026"/>
+            <w:tcBorders>
+              <w:top w:val="single" w:color="BFBFBF" w:sz="4"/>
+              <w:left w:val="single" w:color="BFBFBF" w:sz="4"/>
+              <w:bottom w:val="single" w:color="BFBFBF" w:sz="4"/>
+              <w:right w:val="single" w:color="BFBFBF" w:sz="4"/>
+            </w:tcBorders>
+            <w:tcMar>
+              <w:top w:type="dxa" w:w="80"/>
+              <w:left w:type="dxa" w:w="120"/>
+              <w:bottom w:type="dxa" w:w="80"/>
+              <w:right w:type="dxa" w:w="120"/>
+            </w:tcMar>
+            <w:vAlign w:val="center"/>
+          </w:tcPr>
+          <w:p>
+            <w:pPr>
+              <w:jc w:val="left"/>
+            </w:pPr>
+            <w:r>
+              <w:rPr>
+                <w:rFonts w:ascii="Calibri" w:cs="Calibri" w:eastAsia="Calibri" w:hAnsi="Calibri"/>
+                <w:b w:val="false"/>
+                <w:bCs w:val="false"/>
+                <w:sz w:val="21"/>
+                <w:szCs w:val="21"/>
+              </w:rPr>
+              <w:t xml:space="preserve">Also analyze(hand); distances corrected for the image aspect ratio; HandData carries the aspect ratio</w:t>
+            </w:r>
+          </w:p>
+        </w:tc>
+        <w:tc>
+          <w:tcPr>
+            <w:tcW w:type="dxa" w:w="2200"/>
+            <w:tcBorders>
+              <w:top w:val="single" w:color="BFBFBF" w:sz="4"/>
+              <w:left w:val="single" w:color="BFBFBF" w:sz="4"/>
+              <w:bottom w:val="single" w:color="BFBFBF" w:sz="4"/>
+              <w:right w:val="single" w:color="BFBFBF" w:sz="4"/>
+            </w:tcBorders>
+            <w:tcMar>
+              <w:top w:type="dxa" w:w="80"/>
+              <w:left w:type="dxa" w:w="120"/>
+              <w:bottom w:type="dxa" w:w="80"/>
+              <w:right w:type="dxa" w:w="120"/>
+            </w:tcMar>
+            <w:vAlign w:val="center"/>
+          </w:tcPr>
+          <w:p>
+            <w:pPr>
+              <w:jc w:val="left"/>
+            </w:pPr>
+            <w:r>
+              <w:rPr>
+                <w:rFonts w:ascii="Calibri" w:cs="Calibri" w:eastAsia="Calibri" w:hAnsi="Calibri"/>
+                <w:b w:val="false"/>
+                <w:bCs w:val="false"/>
+                <w:sz w:val="21"/>
+                <w:szCs w:val="21"/>
+              </w:rPr>
+              <w:t xml:space="preserve">Same result on square and wide images.</w:t>
+            </w:r>
+          </w:p>
+        </w:tc>
+      </w:tr>
+      <w:tr>
+        <w:trPr>
+          <w:cantSplit/>
+        </w:trPr>
+        <w:tc>
+          <w:tcPr>
+            <w:tcW w:type="dxa" w:w="1500"/>
+            <w:tcBorders>
+              <w:top w:val="single" w:color="BFBFBF" w:sz="4"/>
+              <w:left w:val="single" w:color="BFBFBF" w:sz="4"/>
+              <w:bottom w:val="single" w:color="BFBFBF" w:sz="4"/>
+              <w:right w:val="single" w:color="BFBFBF" w:sz="4"/>
+            </w:tcBorders>
+            <w:shd w:fill="F2F6FA" w:color="auto" w:val="clear"/>
+            <w:tcMar>
+              <w:top w:type="dxa" w:w="80"/>
+              <w:left w:type="dxa" w:w="120"/>
+              <w:bottom w:type="dxa" w:w="80"/>
+              <w:right w:type="dxa" w:w="120"/>
+            </w:tcMar>
+            <w:vAlign w:val="center"/>
+          </w:tcPr>
+          <w:p>
+            <w:pPr>
+              <w:jc w:val="left"/>
+            </w:pPr>
+            <w:r>
+              <w:rPr>
+                <w:rFonts w:ascii="Calibri" w:cs="Calibri" w:eastAsia="Calibri" w:hAnsi="Calibri"/>
+                <w:b/>
+                <w:bCs/>
+                <w:sz w:val="21"/>
+                <w:szCs w:val="21"/>
+              </w:rPr>
+              <w:t xml:space="preserve">Folders</w:t>
+            </w:r>
+          </w:p>
+        </w:tc>
+        <w:tc>
+          <w:tcPr>
+            <w:tcW w:type="dxa" w:w="2300"/>
+            <w:tcBorders>
+              <w:top w:val="single" w:color="BFBFBF" w:sz="4"/>
+              <w:left w:val="single" w:color="BFBFBF" w:sz="4"/>
+              <w:bottom w:val="single" w:color="BFBFBF" w:sz="4"/>
+              <w:right w:val="single" w:color="BFBFBF" w:sz="4"/>
+            </w:tcBorders>
+            <w:shd w:fill="F2F6FA" w:color="auto" w:val="clear"/>
+            <w:tcMar>
+              <w:top w:type="dxa" w:w="80"/>
+              <w:left w:type="dxa" w:w="120"/>
+              <w:bottom w:type="dxa" w:w="80"/>
+              <w:right w:type="dxa" w:w="120"/>
+            </w:tcMar>
+            <w:vAlign w:val="center"/>
+          </w:tcPr>
+          <w:p>
+            <w:pPr>
+              <w:jc w:val="left"/>
+            </w:pPr>
+            <w:r>
+              <w:rPr>
+                <w:rFonts w:ascii="Calibri" w:cs="Calibri" w:eastAsia="Calibri" w:hAnsi="Calibri"/>
+                <w:b w:val="false"/>
+                <w:bCs w:val="false"/>
+                <w:sz w:val="21"/>
+                <w:szCs w:val="21"/>
+              </w:rPr>
+              <w:t xml:space="preserve">Packages only</w:t>
+            </w:r>
+          </w:p>
+        </w:tc>
+        <w:tc>
+          <w:tcPr>
+            <w:tcW w:type="dxa" w:w="3026"/>
+            <w:tcBorders>
+              <w:top w:val="single" w:color="BFBFBF" w:sz="4"/>
+              <w:left w:val="single" w:color="BFBFBF" w:sz="4"/>
+              <w:bottom w:val="single" w:color="BFBFBF" w:sz="4"/>
+              <w:right w:val="single" w:color="BFBFBF" w:sz="4"/>
+            </w:tcBorders>
+            <w:shd w:fill="F2F6FA" w:color="auto" w:val="clear"/>
+            <w:tcMar>
+              <w:top w:type="dxa" w:w="80"/>
+              <w:left w:type="dxa" w:w="120"/>
+              <w:bottom w:type="dxa" w:w="80"/>
+              <w:right w:type="dxa" w:w="120"/>
+            </w:tcMar>
+            <w:vAlign w:val="center"/>
+          </w:tcPr>
+          <w:p>
+            <w:pPr>
+              <w:jc w:val="left"/>
+            </w:pPr>
+            <w:r>
+              <w:rPr>
+                <w:rFonts w:ascii="Calibri" w:cs="Calibri" w:eastAsia="Calibri" w:hAnsi="Calibri"/>
+                <w:b w:val="false"/>
+                <w:bCs w:val="false"/>
+                <w:sz w:val="21"/>
+                <w:szCs w:val="21"/>
+              </w:rPr>
+              <w:t xml:space="preserve">Also assets/, docs/, download_model.py and measurement tools</w:t>
+            </w:r>
+          </w:p>
+        </w:tc>
+        <w:tc>
+          <w:tcPr>
+            <w:tcW w:type="dxa" w:w="2200"/>
+            <w:tcBorders>
+              <w:top w:val="single" w:color="BFBFBF" w:sz="4"/>
+              <w:left w:val="single" w:color="BFBFBF" w:sz="4"/>
+              <w:bottom w:val="single" w:color="BFBFBF" w:sz="4"/>
+              <w:right w:val="single" w:color="BFBFBF" w:sz="4"/>
+            </w:tcBorders>
+            <w:shd w:fill="F2F6FA" w:color="auto" w:val="clear"/>
+            <w:tcMar>
+              <w:top w:type="dxa" w:w="80"/>
+              <w:left w:type="dxa" w:w="120"/>
+              <w:bottom w:type="dxa" w:w="80"/>
+              <w:right w:type="dxa" w:w="120"/>
+            </w:tcMar>
+            <w:vAlign w:val="center"/>
+          </w:tcPr>
+          <w:p>
+            <w:pPr>
+              <w:jc w:val="left"/>
+            </w:pPr>
+            <w:r>
+              <w:rPr>
+                <w:rFonts w:ascii="Calibri" w:cs="Calibri" w:eastAsia="Calibri" w:hAnsi="Calibri"/>
+                <w:b w:val="false"/>
+                <w:bCs w:val="false"/>
+                <w:sz w:val="21"/>
+                <w:szCs w:val="21"/>
+              </w:rPr>
+              <w:t xml:space="preserve">Documentation and test tools belong to the project.</w:t>
+            </w:r>
+          </w:p>
+        </w:tc>
+      </w:tr>
+    </w:tbl>
     <w:p>
       <w:pPr>
         <w:pStyle w:val="Heading1"/>
@@ -4862,7 +7336,7 @@
           <w:sz w:val="22"/>
           <w:szCs w:val="22"/>
         </w:rPr>
-        <w:t xml:space="preserve">Paste this text into PlantUML (plantuml.com/plantuml) to generate the Class Diagram. You can also redraw it manually in draw.io using the UML class shapes.</w:t>
+        <w:t xml:space="preserve">Paste this text into PlantUML (plantuml.com/plantuml) to generate the Class Diagram of the final program. You can also redraw it manually in draw.io using the UML class shapes.</w:t>
       </w:r>
     </w:p>
     <w:p>
@@ -4946,49 +7420,63 @@
           <w:sz w:val="19"/>
           <w:szCs w:val="19"/>
         </w:rPr>
-        <w:t xml:space="preserve">  +on_start_stop_clicked()</w:t>
-      </w:r>
-    </w:p>
-    <w:p>
-      <w:pPr>
-        <w:shd w:fill="F2F2F2" w:color="auto" w:val="clear"/>
-        <w:spacing w:after="0" w:line="252"/>
-      </w:pPr>
-      <w:r>
-        <w:rPr>
-          <w:rFonts w:ascii="Consolas" w:cs="Consolas" w:eastAsia="Consolas" w:hAnsi="Consolas"/>
-          <w:sz w:val="19"/>
-          <w:szCs w:val="19"/>
-        </w:rPr>
-        <w:t xml:space="preserve">  +on_enable_clicked()</w:t>
-      </w:r>
-    </w:p>
-    <w:p>
-      <w:pPr>
-        <w:shd w:fill="F2F2F2" w:color="auto" w:val="clear"/>
-        <w:spacing w:after="0" w:line="252"/>
-      </w:pPr>
-      <w:r>
-        <w:rPr>
-          <w:rFonts w:ascii="Consolas" w:cs="Consolas" w:eastAsia="Consolas" w:hAnsi="Consolas"/>
-          <w:sz w:val="19"/>
-          <w:szCs w:val="19"/>
-        </w:rPr>
-        <w:t xml:space="preserve">  +show_frame(frame)</w:t>
-      </w:r>
-    </w:p>
-    <w:p>
-      <w:pPr>
-        <w:shd w:fill="F2F2F2" w:color="auto" w:val="clear"/>
-        <w:spacing w:after="0" w:line="252"/>
-      </w:pPr>
-      <w:r>
-        <w:rPr>
-          <w:rFonts w:ascii="Consolas" w:cs="Consolas" w:eastAsia="Consolas" w:hAnsi="Consolas"/>
-          <w:sz w:val="19"/>
-          <w:szCs w:val="19"/>
-        </w:rPr>
-        <w:t xml:space="preserve">  +show_status(gesture, volume)</w:t>
+        <w:t xml:space="preserve">  +toggle_enabled()</w:t>
+      </w:r>
+    </w:p>
+    <w:p>
+      <w:pPr>
+        <w:shd w:fill="F2F2F2" w:color="auto" w:val="clear"/>
+        <w:spacing w:after="0" w:line="252"/>
+      </w:pPr>
+      <w:r>
+        <w:rPr>
+          <w:rFonts w:ascii="Consolas" w:cs="Consolas" w:eastAsia="Consolas" w:hAnsi="Consolas"/>
+          <w:sz w:val="19"/>
+          <w:szCs w:val="19"/>
+        </w:rPr>
+        <w:t xml:space="preserve">  +set_video_state(playing)</w:t>
+      </w:r>
+    </w:p>
+    <w:p>
+      <w:pPr>
+        <w:shd w:fill="F2F2F2" w:color="auto" w:val="clear"/>
+        <w:spacing w:after="0" w:line="252"/>
+      </w:pPr>
+      <w:r>
+        <w:rPr>
+          <w:rFonts w:ascii="Consolas" w:cs="Consolas" w:eastAsia="Consolas" w:hAnsi="Consolas"/>
+          <w:sz w:val="19"/>
+          <w:szCs w:val="19"/>
+        </w:rPr>
+        <w:t xml:space="preserve">  +retry_camera()</w:t>
+      </w:r>
+    </w:p>
+    <w:p>
+      <w:pPr>
+        <w:shd w:fill="F2F2F2" w:color="auto" w:val="clear"/>
+        <w:spacing w:after="0" w:line="252"/>
+      </w:pPr>
+      <w:r>
+        <w:rPr>
+          <w:rFonts w:ascii="Consolas" w:cs="Consolas" w:eastAsia="Consolas" w:hAnsi="Consolas"/>
+          <w:sz w:val="19"/>
+          <w:szCs w:val="19"/>
+        </w:rPr>
+        <w:t xml:space="preserve">  +run()</w:t>
+      </w:r>
+    </w:p>
+    <w:p>
+      <w:pPr>
+        <w:shd w:fill="F2F2F2" w:color="auto" w:val="clear"/>
+        <w:spacing w:after="0" w:line="252"/>
+      </w:pPr>
+      <w:r>
+        <w:rPr>
+          <w:rFonts w:ascii="Consolas" w:cs="Consolas" w:eastAsia="Consolas" w:hAnsi="Consolas"/>
+          <w:sz w:val="19"/>
+          <w:szCs w:val="19"/>
+        </w:rPr>
+        <w:t xml:space="preserve">  +close()</w:t>
       </w:r>
     </w:p>
     <w:p>
@@ -5030,77 +7518,91 @@
           <w:sz w:val="19"/>
           <w:szCs w:val="19"/>
         </w:rPr>
-        <w:t xml:space="preserve">  -camera_running: bool</w:t>
-      </w:r>
-    </w:p>
-    <w:p>
-      <w:pPr>
-        <w:shd w:fill="F2F2F2" w:color="auto" w:val="clear"/>
-        <w:spacing w:after="0" w:line="252"/>
-      </w:pPr>
-      <w:r>
-        <w:rPr>
-          <w:rFonts w:ascii="Consolas" w:cs="Consolas" w:eastAsia="Consolas" w:hAnsi="Consolas"/>
-          <w:sz w:val="19"/>
-          <w:szCs w:val="19"/>
-        </w:rPr>
-        <w:t xml:space="preserve">  -control_enabled: bool</w:t>
-      </w:r>
-    </w:p>
-    <w:p>
-      <w:pPr>
-        <w:shd w:fill="F2F2F2" w:color="auto" w:val="clear"/>
-        <w:spacing w:after="0" w:line="252"/>
-      </w:pPr>
-      <w:r>
-        <w:rPr>
-          <w:rFonts w:ascii="Consolas" w:cs="Consolas" w:eastAsia="Consolas" w:hAnsi="Consolas"/>
-          <w:sz w:val="19"/>
-          <w:szCs w:val="19"/>
-        </w:rPr>
-        <w:t xml:space="preserve">  +start_camera()</w:t>
-      </w:r>
-    </w:p>
-    <w:p>
-      <w:pPr>
-        <w:shd w:fill="F2F2F2" w:color="auto" w:val="clear"/>
-        <w:spacing w:after="0" w:line="252"/>
-      </w:pPr>
-      <w:r>
-        <w:rPr>
-          <w:rFonts w:ascii="Consolas" w:cs="Consolas" w:eastAsia="Consolas" w:hAnsi="Consolas"/>
-          <w:sz w:val="19"/>
-          <w:szCs w:val="19"/>
-        </w:rPr>
-        <w:t xml:space="preserve">  +stop_camera()</w:t>
-      </w:r>
-    </w:p>
-    <w:p>
-      <w:pPr>
-        <w:shd w:fill="F2F2F2" w:color="auto" w:val="clear"/>
-        <w:spacing w:after="0" w:line="252"/>
-      </w:pPr>
-      <w:r>
-        <w:rPr>
-          <w:rFonts w:ascii="Consolas" w:cs="Consolas" w:eastAsia="Consolas" w:hAnsi="Consolas"/>
-          <w:sz w:val="19"/>
-          <w:szCs w:val="19"/>
-        </w:rPr>
-        <w:t xml:space="preserve">  +set_control(enabled: bool)</w:t>
-      </w:r>
-    </w:p>
-    <w:p>
-      <w:pPr>
-        <w:shd w:fill="F2F2F2" w:color="auto" w:val="clear"/>
-        <w:spacing w:after="0" w:line="252"/>
-      </w:pPr>
-      <w:r>
-        <w:rPr>
-          <w:rFonts w:ascii="Consolas" w:cs="Consolas" w:eastAsia="Consolas" w:hAnsi="Consolas"/>
-          <w:sz w:val="19"/>
-          <w:szCs w:val="19"/>
-        </w:rPr>
-        <w:t xml:space="preserve">  +process_frame()</w:t>
+        <w:t xml:space="preserve">  -enabled: bool</w:t>
+      </w:r>
+    </w:p>
+    <w:p>
+      <w:pPr>
+        <w:shd w:fill="F2F2F2" w:color="auto" w:val="clear"/>
+        <w:spacing w:after="0" w:line="252"/>
+      </w:pPr>
+      <w:r>
+        <w:rPr>
+          <w:rFonts w:ascii="Consolas" w:cs="Consolas" w:eastAsia="Consolas" w:hAnsi="Consolas"/>
+          <w:sz w:val="19"/>
+          <w:szCs w:val="19"/>
+        </w:rPr>
+        <w:t xml:space="preserve">  -running: bool</w:t>
+      </w:r>
+    </w:p>
+    <w:p>
+      <w:pPr>
+        <w:shd w:fill="F2F2F2" w:color="auto" w:val="clear"/>
+        <w:spacing w:after="0" w:line="252"/>
+      </w:pPr>
+      <w:r>
+        <w:rPr>
+          <w:rFonts w:ascii="Consolas" w:cs="Consolas" w:eastAsia="Consolas" w:hAnsi="Consolas"/>
+          <w:sz w:val="19"/>
+          <w:szCs w:val="19"/>
+        </w:rPr>
+        <w:t xml:space="preserve">  -message: str</w:t>
+      </w:r>
+    </w:p>
+    <w:p>
+      <w:pPr>
+        <w:shd w:fill="F2F2F2" w:color="auto" w:val="clear"/>
+        <w:spacing w:after="0" w:line="252"/>
+      </w:pPr>
+      <w:r>
+        <w:rPr>
+          <w:rFonts w:ascii="Consolas" w:cs="Consolas" w:eastAsia="Consolas" w:hAnsi="Consolas"/>
+          <w:sz w:val="19"/>
+          <w:szCs w:val="19"/>
+        </w:rPr>
+        <w:t xml:space="preserve">  +start(): bool</w:t>
+      </w:r>
+    </w:p>
+    <w:p>
+      <w:pPr>
+        <w:shd w:fill="F2F2F2" w:color="auto" w:val="clear"/>
+        <w:spacing w:after="0" w:line="252"/>
+      </w:pPr>
+      <w:r>
+        <w:rPr>
+          <w:rFonts w:ascii="Consolas" w:cs="Consolas" w:eastAsia="Consolas" w:hAnsi="Consolas"/>
+          <w:sz w:val="19"/>
+          <w:szCs w:val="19"/>
+        </w:rPr>
+        <w:t xml:space="preserve">  +stop()</w:t>
+      </w:r>
+    </w:p>
+    <w:p>
+      <w:pPr>
+        <w:shd w:fill="F2F2F2" w:color="auto" w:val="clear"/>
+        <w:spacing w:after="0" w:line="252"/>
+      </w:pPr>
+      <w:r>
+        <w:rPr>
+          <w:rFonts w:ascii="Consolas" w:cs="Consolas" w:eastAsia="Consolas" w:hAnsi="Consolas"/>
+          <w:sz w:val="19"/>
+          <w:szCs w:val="19"/>
+        </w:rPr>
+        <w:t xml:space="preserve">  +set_enabled(on)</w:t>
+      </w:r>
+    </w:p>
+    <w:p>
+      <w:pPr>
+        <w:shd w:fill="F2F2F2" w:color="auto" w:val="clear"/>
+        <w:spacing w:after="0" w:line="252"/>
+      </w:pPr>
+      <w:r>
+        <w:rPr>
+          <w:rFonts w:ascii="Consolas" w:cs="Consolas" w:eastAsia="Consolas" w:hAnsi="Consolas"/>
+          <w:sz w:val="19"/>
+          <w:szCs w:val="19"/>
+        </w:rPr>
+        <w:t xml:space="preserve">  +process_frame(): FrameResult</w:t>
       </w:r>
     </w:p>
     <w:p>
@@ -5156,6 +7658,20 @@
           <w:sz w:val="19"/>
           <w:szCs w:val="19"/>
         </w:rPr>
+        <w:t xml:space="preserve">  -fourcc, width, height, fps</w:t>
+      </w:r>
+    </w:p>
+    <w:p>
+      <w:pPr>
+        <w:shd w:fill="F2F2F2" w:color="auto" w:val="clear"/>
+        <w:spacing w:after="0" w:line="252"/>
+      </w:pPr>
+      <w:r>
+        <w:rPr>
+          <w:rFonts w:ascii="Consolas" w:cs="Consolas" w:eastAsia="Consolas" w:hAnsi="Consolas"/>
+          <w:sz w:val="19"/>
+          <w:szCs w:val="19"/>
+        </w:rPr>
         <w:t xml:space="preserve">  +open(): bool</w:t>
       </w:r>
     </w:p>
@@ -5226,7 +7742,7 @@
           <w:sz w:val="19"/>
           <w:szCs w:val="19"/>
         </w:rPr>
-        <w:t xml:space="preserve">  -hands</w:t>
+        <w:t xml:space="preserve">  -landmarker</w:t>
       </w:r>
     </w:p>
     <w:p>
@@ -5268,6 +7784,20 @@
           <w:sz w:val="19"/>
           <w:szCs w:val="19"/>
         </w:rPr>
+        <w:t xml:space="preserve">  +close()</w:t>
+      </w:r>
+    </w:p>
+    <w:p>
+      <w:pPr>
+        <w:shd w:fill="F2F2F2" w:color="auto" w:val="clear"/>
+        <w:spacing w:after="0" w:line="252"/>
+      </w:pPr>
+      <w:r>
+        <w:rPr>
+          <w:rFonts w:ascii="Consolas" w:cs="Consolas" w:eastAsia="Consolas" w:hAnsi="Consolas"/>
+          <w:sz w:val="19"/>
+          <w:szCs w:val="19"/>
+        </w:rPr>
         <w:t xml:space="preserve">}</w:t>
       </w:r>
     </w:p>
@@ -5282,6 +7812,104 @@
           <w:sz w:val="19"/>
           <w:szCs w:val="19"/>
         </w:rPr>
+        <w:t xml:space="preserve">class MotionFilter {</w:t>
+      </w:r>
+    </w:p>
+    <w:p>
+      <w:pPr>
+        <w:shd w:fill="F2F2F2" w:color="auto" w:val="clear"/>
+        <w:spacing w:after="0" w:line="252"/>
+      </w:pPr>
+      <w:r>
+        <w:rPr>
+          <w:rFonts w:ascii="Consolas" w:cs="Consolas" w:eastAsia="Consolas" w:hAnsi="Consolas"/>
+          <w:sz w:val="19"/>
+          <w:szCs w:val="19"/>
+        </w:rPr>
+        <w:t xml:space="preserve">  -max_change = 0.08</w:t>
+      </w:r>
+    </w:p>
+    <w:p>
+      <w:pPr>
+        <w:shd w:fill="F2F2F2" w:color="auto" w:val="clear"/>
+        <w:spacing w:after="0" w:line="252"/>
+      </w:pPr>
+      <w:r>
+        <w:rPr>
+          <w:rFonts w:ascii="Consolas" w:cs="Consolas" w:eastAsia="Consolas" w:hAnsi="Consolas"/>
+          <w:sz w:val="19"/>
+          <w:szCs w:val="19"/>
+        </w:rPr>
+        <w:t xml:space="preserve">  -window_seconds = 0.2</w:t>
+      </w:r>
+    </w:p>
+    <w:p>
+      <w:pPr>
+        <w:shd w:fill="F2F2F2" w:color="auto" w:val="clear"/>
+        <w:spacing w:after="0" w:line="252"/>
+      </w:pPr>
+      <w:r>
+        <w:rPr>
+          <w:rFonts w:ascii="Consolas" w:cs="Consolas" w:eastAsia="Consolas" w:hAnsi="Consolas"/>
+          <w:sz w:val="19"/>
+          <w:szCs w:val="19"/>
+        </w:rPr>
+        <w:t xml:space="preserve">  +update(hand, now): float</w:t>
+      </w:r>
+    </w:p>
+    <w:p>
+      <w:pPr>
+        <w:shd w:fill="F2F2F2" w:color="auto" w:val="clear"/>
+        <w:spacing w:after="0" w:line="252"/>
+      </w:pPr>
+      <w:r>
+        <w:rPr>
+          <w:rFonts w:ascii="Consolas" w:cs="Consolas" w:eastAsia="Consolas" w:hAnsi="Consolas"/>
+          <w:sz w:val="19"/>
+          <w:szCs w:val="19"/>
+        </w:rPr>
+        <w:t xml:space="preserve">  +steady: bool</w:t>
+      </w:r>
+    </w:p>
+    <w:p>
+      <w:pPr>
+        <w:shd w:fill="F2F2F2" w:color="auto" w:val="clear"/>
+        <w:spacing w:after="0" w:line="252"/>
+      </w:pPr>
+      <w:r>
+        <w:rPr>
+          <w:rFonts w:ascii="Consolas" w:cs="Consolas" w:eastAsia="Consolas" w:hAnsi="Consolas"/>
+          <w:sz w:val="19"/>
+          <w:szCs w:val="19"/>
+        </w:rPr>
+        <w:t xml:space="preserve">  +reset()</w:t>
+      </w:r>
+    </w:p>
+    <w:p>
+      <w:pPr>
+        <w:shd w:fill="F2F2F2" w:color="auto" w:val="clear"/>
+        <w:spacing w:after="0" w:line="252"/>
+      </w:pPr>
+      <w:r>
+        <w:rPr>
+          <w:rFonts w:ascii="Consolas" w:cs="Consolas" w:eastAsia="Consolas" w:hAnsi="Consolas"/>
+          <w:sz w:val="19"/>
+          <w:szCs w:val="19"/>
+        </w:rPr>
+        <w:t xml:space="preserve">}</w:t>
+      </w:r>
+    </w:p>
+    <w:p>
+      <w:pPr>
+        <w:shd w:fill="F2F2F2" w:color="auto" w:val="clear"/>
+        <w:spacing w:after="0" w:line="252"/>
+      </w:pPr>
+      <w:r>
+        <w:rPr>
+          <w:rFonts w:ascii="Consolas" w:cs="Consolas" w:eastAsia="Consolas" w:hAnsi="Consolas"/>
+          <w:sz w:val="19"/>
+          <w:szCs w:val="19"/>
+        </w:rPr>
         <w:t xml:space="preserve">class GestureRecognizer {</w:t>
       </w:r>
     </w:p>
@@ -5296,7 +7924,21 @@
           <w:sz w:val="19"/>
           <w:szCs w:val="19"/>
         </w:rPr>
-        <w:t xml:space="preserve">  -rules</w:t>
+        <w:t xml:space="preserve">  -thresholds</w:t>
+      </w:r>
+    </w:p>
+    <w:p>
+      <w:pPr>
+        <w:shd w:fill="F2F2F2" w:color="auto" w:val="clear"/>
+        <w:spacing w:after="0" w:line="252"/>
+      </w:pPr>
+      <w:r>
+        <w:rPr>
+          <w:rFonts w:ascii="Consolas" w:cs="Consolas" w:eastAsia="Consolas" w:hAnsi="Consolas"/>
+          <w:sz w:val="19"/>
+          <w:szCs w:val="19"/>
+        </w:rPr>
+        <w:t xml:space="preserve">  +analyze(hand): dict</w:t>
       </w:r>
     </w:p>
     <w:p>
@@ -5352,35 +7994,49 @@
           <w:sz w:val="19"/>
           <w:szCs w:val="19"/>
         </w:rPr>
-        <w:t xml:space="preserve">  -hold_time: float</w:t>
-      </w:r>
-    </w:p>
-    <w:p>
-      <w:pPr>
-        <w:shd w:fill="F2F2F2" w:color="auto" w:val="clear"/>
-        <w:spacing w:after="0" w:line="252"/>
-      </w:pPr>
-      <w:r>
-        <w:rPr>
-          <w:rFonts w:ascii="Consolas" w:cs="Consolas" w:eastAsia="Consolas" w:hAnsi="Consolas"/>
-          <w:sz w:val="19"/>
-          <w:szCs w:val="19"/>
-        </w:rPr>
-        <w:t xml:space="preserve">  -cooldown: float</w:t>
-      </w:r>
-    </w:p>
-    <w:p>
-      <w:pPr>
-        <w:shd w:fill="F2F2F2" w:color="auto" w:val="clear"/>
-        <w:spacing w:after="0" w:line="252"/>
-      </w:pPr>
-      <w:r>
-        <w:rPr>
-          <w:rFonts w:ascii="Consolas" w:cs="Consolas" w:eastAsia="Consolas" w:hAnsi="Consolas"/>
-          <w:sz w:val="19"/>
-          <w:szCs w:val="19"/>
-        </w:rPr>
-        <w:t xml:space="preserve">  +update(gesture): GestureType</w:t>
+        <w:t xml:space="preserve">  -required_frames</w:t>
+      </w:r>
+    </w:p>
+    <w:p>
+      <w:pPr>
+        <w:shd w:fill="F2F2F2" w:color="auto" w:val="clear"/>
+        <w:spacing w:after="0" w:line="252"/>
+      </w:pPr>
+      <w:r>
+        <w:rPr>
+          <w:rFonts w:ascii="Consolas" w:cs="Consolas" w:eastAsia="Consolas" w:hAnsi="Consolas"/>
+          <w:sz w:val="19"/>
+          <w:szCs w:val="19"/>
+        </w:rPr>
+        <w:t xml:space="preserve">  -per_gesture: dict</w:t>
+      </w:r>
+    </w:p>
+    <w:p>
+      <w:pPr>
+        <w:shd w:fill="F2F2F2" w:color="auto" w:val="clear"/>
+        <w:spacing w:after="0" w:line="252"/>
+      </w:pPr>
+      <w:r>
+        <w:rPr>
+          <w:rFonts w:ascii="Consolas" w:cs="Consolas" w:eastAsia="Consolas" w:hAnsi="Consolas"/>
+          <w:sz w:val="19"/>
+          <w:szCs w:val="19"/>
+        </w:rPr>
+        <w:t xml:space="preserve">  +update(raw): GestureType</w:t>
+      </w:r>
+    </w:p>
+    <w:p>
+      <w:pPr>
+        <w:shd w:fill="F2F2F2" w:color="auto" w:val="clear"/>
+        <w:spacing w:after="0" w:line="252"/>
+      </w:pPr>
+      <w:r>
+        <w:rPr>
+          <w:rFonts w:ascii="Consolas" w:cs="Consolas" w:eastAsia="Consolas" w:hAnsi="Consolas"/>
+          <w:sz w:val="19"/>
+          <w:szCs w:val="19"/>
+        </w:rPr>
+        <w:t xml:space="preserve">  +reset()</w:t>
       </w:r>
     </w:p>
     <w:p>
@@ -5422,7 +8078,21 @@
           <w:sz w:val="19"/>
           <w:szCs w:val="19"/>
         </w:rPr>
-        <w:t xml:space="preserve">  -mapping: dict</w:t>
+        <w:t xml:space="preserve">  -table: dict</w:t>
+      </w:r>
+    </w:p>
+    <w:p>
+      <w:pPr>
+        <w:shd w:fill="F2F2F2" w:color="auto" w:val="clear"/>
+        <w:spacing w:after="0" w:line="252"/>
+      </w:pPr>
+      <w:r>
+        <w:rPr>
+          <w:rFonts w:ascii="Consolas" w:cs="Consolas" w:eastAsia="Consolas" w:hAnsi="Consolas"/>
+          <w:sz w:val="19"/>
+          <w:szCs w:val="19"/>
+        </w:rPr>
+        <w:t xml:space="preserve">  -repeat_interval = 0.3</w:t>
       </w:r>
     </w:p>
     <w:p>
@@ -5450,6 +8120,20 @@
           <w:sz w:val="19"/>
           <w:szCs w:val="19"/>
         </w:rPr>
+        <w:t xml:space="preserve">  +reset()</w:t>
+      </w:r>
+    </w:p>
+    <w:p>
+      <w:pPr>
+        <w:shd w:fill="F2F2F2" w:color="auto" w:val="clear"/>
+        <w:spacing w:after="0" w:line="252"/>
+      </w:pPr>
+      <w:r>
+        <w:rPr>
+          <w:rFonts w:ascii="Consolas" w:cs="Consolas" w:eastAsia="Consolas" w:hAnsi="Consolas"/>
+          <w:sz w:val="19"/>
+          <w:szCs w:val="19"/>
+        </w:rPr>
         <w:t xml:space="preserve">}</w:t>
       </w:r>
     </w:p>
@@ -5492,35 +8176,49 @@
           <w:sz w:val="19"/>
           <w:szCs w:val="19"/>
         </w:rPr>
-        <w:t xml:space="preserve">  +increase(step)</w:t>
-      </w:r>
-    </w:p>
-    <w:p>
-      <w:pPr>
-        <w:shd w:fill="F2F2F2" w:color="auto" w:val="clear"/>
-        <w:spacing w:after="0" w:line="252"/>
-      </w:pPr>
-      <w:r>
-        <w:rPr>
-          <w:rFonts w:ascii="Consolas" w:cs="Consolas" w:eastAsia="Consolas" w:hAnsi="Consolas"/>
-          <w:sz w:val="19"/>
-          <w:szCs w:val="19"/>
-        </w:rPr>
-        <w:t xml:space="preserve">  +decrease(step)</w:t>
-      </w:r>
-    </w:p>
-    <w:p>
-      <w:pPr>
-        <w:shd w:fill="F2F2F2" w:color="auto" w:val="clear"/>
-        <w:spacing w:after="0" w:line="252"/>
-      </w:pPr>
-      <w:r>
-        <w:rPr>
-          <w:rFonts w:ascii="Consolas" w:cs="Consolas" w:eastAsia="Consolas" w:hAnsi="Consolas"/>
-          <w:sz w:val="19"/>
-          <w:szCs w:val="19"/>
-        </w:rPr>
-        <w:t xml:space="preserve">  +get_level(): int</w:t>
+        <w:t xml:space="preserve">  -step = 0.05</w:t>
+      </w:r>
+    </w:p>
+    <w:p>
+      <w:pPr>
+        <w:shd w:fill="F2F2F2" w:color="auto" w:val="clear"/>
+        <w:spacing w:after="0" w:line="252"/>
+      </w:pPr>
+      <w:r>
+        <w:rPr>
+          <w:rFonts w:ascii="Consolas" w:cs="Consolas" w:eastAsia="Consolas" w:hAnsi="Consolas"/>
+          <w:sz w:val="19"/>
+          <w:szCs w:val="19"/>
+        </w:rPr>
+        <w:t xml:space="preserve">  +volume_up()</w:t>
+      </w:r>
+    </w:p>
+    <w:p>
+      <w:pPr>
+        <w:shd w:fill="F2F2F2" w:color="auto" w:val="clear"/>
+        <w:spacing w:after="0" w:line="252"/>
+      </w:pPr>
+      <w:r>
+        <w:rPr>
+          <w:rFonts w:ascii="Consolas" w:cs="Consolas" w:eastAsia="Consolas" w:hAnsi="Consolas"/>
+          <w:sz w:val="19"/>
+          <w:szCs w:val="19"/>
+        </w:rPr>
+        <w:t xml:space="preserve">  +volume_down()</w:t>
+      </w:r>
+    </w:p>
+    <w:p>
+      <w:pPr>
+        <w:shd w:fill="F2F2F2" w:color="auto" w:val="clear"/>
+        <w:spacing w:after="0" w:line="252"/>
+      </w:pPr>
+      <w:r>
+        <w:rPr>
+          <w:rFonts w:ascii="Consolas" w:cs="Consolas" w:eastAsia="Consolas" w:hAnsi="Consolas"/>
+          <w:sz w:val="19"/>
+          <w:szCs w:val="19"/>
+        </w:rPr>
+        <w:t xml:space="preserve">  +get_volume(): float</w:t>
       </w:r>
     </w:p>
     <w:p>
@@ -5562,7 +8260,21 @@
           <w:sz w:val="19"/>
           <w:szCs w:val="19"/>
         </w:rPr>
-        <w:t xml:space="preserve">  -is_playing: bool</w:t>
+        <w:t xml:space="preserve">  -is_playing: bool or None</w:t>
+      </w:r>
+    </w:p>
+    <w:p>
+      <w:pPr>
+        <w:shd w:fill="F2F2F2" w:color="auto" w:val="clear"/>
+        <w:spacing w:after="0" w:line="252"/>
+      </w:pPr>
+      <w:r>
+        <w:rPr>
+          <w:rFonts w:ascii="Consolas" w:cs="Consolas" w:eastAsia="Consolas" w:hAnsi="Consolas"/>
+          <w:sz w:val="19"/>
+          <w:szCs w:val="19"/>
+        </w:rPr>
+        <w:t xml:space="preserve">  -min_interval = 1.0</w:t>
       </w:r>
     </w:p>
     <w:p>
@@ -5604,6 +8316,20 @@
           <w:sz w:val="19"/>
           <w:szCs w:val="19"/>
         </w:rPr>
+        <w:t xml:space="preserve">  +execute(command)</w:t>
+      </w:r>
+    </w:p>
+    <w:p>
+      <w:pPr>
+        <w:shd w:fill="F2F2F2" w:color="auto" w:val="clear"/>
+        <w:spacing w:after="0" w:line="252"/>
+      </w:pPr>
+      <w:r>
+        <w:rPr>
+          <w:rFonts w:ascii="Consolas" w:cs="Consolas" w:eastAsia="Consolas" w:hAnsi="Consolas"/>
+          <w:sz w:val="19"/>
+          <w:szCs w:val="19"/>
+        </w:rPr>
         <w:t xml:space="preserve">}</w:t>
       </w:r>
     </w:p>
@@ -5646,6 +8372,20 @@
           <w:sz w:val="19"/>
           <w:szCs w:val="19"/>
         </w:rPr>
+        <w:t xml:space="preserve">  aspect_ratio: float</w:t>
+      </w:r>
+    </w:p>
+    <w:p>
+      <w:pPr>
+        <w:shd w:fill="F2F2F2" w:color="auto" w:val="clear"/>
+        <w:spacing w:after="0" w:line="252"/>
+      </w:pPr>
+      <w:r>
+        <w:rPr>
+          <w:rFonts w:ascii="Consolas" w:cs="Consolas" w:eastAsia="Consolas" w:hAnsi="Consolas"/>
+          <w:sz w:val="19"/>
+          <w:szCs w:val="19"/>
+        </w:rPr>
         <w:t xml:space="preserve">}</w:t>
       </w:r>
     </w:p>
@@ -5912,6 +8652,20 @@
           <w:sz w:val="19"/>
           <w:szCs w:val="19"/>
         </w:rPr>
+        <w:t xml:space="preserve">AppController *-- MotionFilter</w:t>
+      </w:r>
+    </w:p>
+    <w:p>
+      <w:pPr>
+        <w:shd w:fill="F2F2F2" w:color="auto" w:val="clear"/>
+        <w:spacing w:after="0" w:line="252"/>
+      </w:pPr>
+      <w:r>
+        <w:rPr>
+          <w:rFonts w:ascii="Consolas" w:cs="Consolas" w:eastAsia="Consolas" w:hAnsi="Consolas"/>
+          <w:sz w:val="19"/>
+          <w:szCs w:val="19"/>
+        </w:rPr>
         <w:t xml:space="preserve">AppController *-- GestureRecognizer</w:t>
       </w:r>
     </w:p>
@@ -5983,6 +8737,20 @@
           <w:szCs w:val="19"/>
         </w:rPr>
         <w:t xml:space="preserve">HandDetector ..&gt; HandData</w:t>
+      </w:r>
+    </w:p>
+    <w:p>
+      <w:pPr>
+        <w:shd w:fill="F2F2F2" w:color="auto" w:val="clear"/>
+        <w:spacing w:after="0" w:line="252"/>
+      </w:pPr>
+      <w:r>
+        <w:rPr>
+          <w:rFonts w:ascii="Consolas" w:cs="Consolas" w:eastAsia="Consolas" w:hAnsi="Consolas"/>
+          <w:sz w:val="19"/>
+          <w:szCs w:val="19"/>
+        </w:rPr>
+        <w:t xml:space="preserve">MotionFilter ..&gt; HandData</w:t>
       </w:r>
     </w:p>
     <w:p>

</xml_diff>